<commit_message>
paper: fix 7 citations, add floor-effect analysis, add negation example
Fix citation errors found by systematic verification:
- Kumar et al. (2020): correct 4 wrong authors
- Wang et al. (2022): correct all 5 wrong authors, fix end page
- Riordan et al. (2017): fix pages 217-227 → 159-168
- Sung et al. (2019): fix to 3 correct authors, fix pages and title
- Dorsey & Michaels (2022): fix pages, add subtitle
- Shermis (2022): fix end page 334 → 337
- Loukina et al. (2019): fix end page 11 → 10

Add Section 5.3 floor-effect analysis with Table 3: SSR corrected
for answers already at score 0 (L0: 42%→55%, L1: 48%→73%).
Add concrete negation failure example in Section 6.2.
Add scripts/analyze_floor_effect.py for reproducibility.
</commit_message>
<xml_diff>
--- a/paper/IFKAD2026_Sasso_DeMauro.docx
+++ b/paper/IFKAD2026_Sasso_DeMauro.docx
@@ -4,7 +4,7 @@
   <w:body>
     <w:p>
       <w:pPr>
-        <w:spacing w:after="200"/>
+        <w:spacing w:after="200" w:line="276"/>
         <w:jc w:val="center"/>
       </w:pPr>
       <w:r>
@@ -20,7 +20,7 @@
     </w:p>
     <w:p>
       <w:pPr>
-        <w:spacing w:after="40"/>
+        <w:spacing w:after="40" w:line="276"/>
         <w:jc w:val="center"/>
       </w:pPr>
       <w:r>
@@ -31,12 +31,30 @@
           <w:sz w:val="20"/>
           <w:szCs w:val="20"/>
         </w:rPr>
-        <w:t xml:space="preserve">Ferdinando Sasso, Andrea De Mauro</w:t>
-      </w:r>
-    </w:p>
-    <w:p>
-      <w:pPr>
-        <w:spacing w:after="40"/>
+        <w:t xml:space="preserve">Ferdinando Sasso</w:t>
+      </w:r>
+      <w:r>
+        <w:rPr>
+          <w:rFonts w:ascii="Calibri" w:cs="Calibri" w:eastAsia="Calibri" w:hAnsi="Calibri"/>
+          <w:sz w:val="20"/>
+          <w:szCs w:val="20"/>
+        </w:rPr>
+        <w:t xml:space="preserve">, </w:t>
+      </w:r>
+      <w:r>
+        <w:rPr>
+          <w:rFonts w:ascii="Calibri" w:cs="Calibri" w:eastAsia="Calibri" w:hAnsi="Calibri"/>
+          <w:b/>
+          <w:bCs/>
+          <w:sz w:val="20"/>
+          <w:szCs w:val="20"/>
+        </w:rPr>
+        <w:t xml:space="preserve">Andrea De Mauro</w:t>
+      </w:r>
+    </w:p>
+    <w:p>
+      <w:pPr>
+        <w:spacing w:after="40" w:line="276"/>
         <w:jc w:val="center"/>
       </w:pPr>
       <w:r>
@@ -52,7 +70,7 @@
     </w:p>
     <w:p>
       <w:pPr>
-        <w:spacing w:after="200"/>
+        <w:spacing w:after="200" w:line="276"/>
         <w:jc w:val="center"/>
       </w:pPr>
       <w:r>
@@ -66,7 +84,7 @@
     </w:p>
     <w:p>
       <w:pPr>
-        <w:spacing w:after="120" w:before="240"/>
+        <w:spacing w:after="120" w:before="240" w:line="276"/>
       </w:pPr>
       <w:r>
         <w:rPr>
@@ -87,6 +105,8 @@
       <w:r>
         <w:rPr>
           <w:rFonts w:ascii="Calibri" w:cs="Calibri" w:eastAsia="Calibri" w:hAnsi="Calibri"/>
+          <w:i/>
+          <w:iCs/>
           <w:sz w:val="20"/>
           <w:szCs w:val="20"/>
         </w:rPr>
@@ -95,7 +115,8 @@
     </w:p>
     <w:p>
       <w:pPr>
-        <w:spacing w:after="120" w:before="120"/>
+        <w:spacing w:after="120" w:line="276"/>
+        <w:jc w:val="both"/>
       </w:pPr>
       <w:r>
         <w:rPr>
@@ -118,7 +139,8 @@
     </w:p>
     <w:p>
       <w:pPr>
-        <w:spacing w:after="200"/>
+        <w:spacing w:after="200" w:line="276"/>
+        <w:jc w:val="both"/>
       </w:pPr>
       <w:r>
         <w:rPr>
@@ -141,7 +163,7 @@
     </w:p>
     <w:p>
       <w:pPr>
-        <w:spacing w:after="120" w:before="240"/>
+        <w:spacing w:after="120" w:before="240" w:line="276"/>
       </w:pPr>
       <w:r>
         <w:rPr>
@@ -240,7 +262,7 @@
     </w:p>
     <w:p>
       <w:pPr>
-        <w:spacing w:after="120" w:line="276"/>
+        <w:spacing w:after="60" w:line="276"/>
         <w:ind w:left="360"/>
         <w:jc w:val="both"/>
       </w:pPr>
@@ -255,7 +277,7 @@
     </w:p>
     <w:p>
       <w:pPr>
-        <w:spacing w:after="120" w:line="276"/>
+        <w:spacing w:after="60" w:line="276"/>
         <w:ind w:left="360"/>
         <w:jc w:val="both"/>
       </w:pPr>
@@ -270,7 +292,7 @@
     </w:p>
     <w:p>
       <w:pPr>
-        <w:spacing w:after="120" w:line="276"/>
+        <w:spacing w:after="60" w:line="276"/>
         <w:ind w:left="360"/>
         <w:jc w:val="both"/>
       </w:pPr>
@@ -285,7 +307,7 @@
     </w:p>
     <w:p>
       <w:pPr>
-        <w:spacing w:after="120" w:before="240"/>
+        <w:spacing w:after="120" w:before="240" w:line="276"/>
       </w:pPr>
       <w:r>
         <w:rPr>
@@ -300,7 +322,7 @@
     </w:p>
     <w:p>
       <w:pPr>
-        <w:spacing w:after="100" w:before="200"/>
+        <w:spacing w:after="100" w:before="200" w:line="276"/>
       </w:pPr>
       <w:r>
         <w:rPr>
@@ -329,7 +351,7 @@
     </w:p>
     <w:p>
       <w:pPr>
-        <w:spacing w:after="100" w:before="200"/>
+        <w:spacing w:after="100" w:before="200" w:line="276"/>
       </w:pPr>
       <w:r>
         <w:rPr>
@@ -412,7 +434,7 @@
     </w:p>
     <w:p>
       <w:pPr>
-        <w:spacing w:after="100" w:before="200"/>
+        <w:spacing w:after="100" w:before="200" w:line="276"/>
       </w:pPr>
       <w:r>
         <w:rPr>
@@ -455,7 +477,7 @@
     </w:p>
     <w:p>
       <w:pPr>
-        <w:spacing w:after="100" w:before="200"/>
+        <w:spacing w:after="100" w:before="200" w:line="276"/>
       </w:pPr>
       <w:r>
         <w:rPr>
@@ -484,7 +506,7 @@
     </w:p>
     <w:p>
       <w:pPr>
-        <w:spacing w:after="100" w:before="200"/>
+        <w:spacing w:after="100" w:before="200" w:line="276"/>
       </w:pPr>
       <w:r>
         <w:rPr>
@@ -513,7 +535,12 @@
     </w:p>
     <w:p>
       <w:pPr>
-        <w:spacing w:after="120" w:line="276"/>
+        <w:pStyle w:val="ListParagraph"/>
+        <w:numPr>
+          <w:ilvl w:val="0"/>
+          <w:numId w:val="1"/>
+        </w:numPr>
+        <w:spacing w:after="60" w:line="276"/>
         <w:ind w:left="360"/>
         <w:jc w:val="both"/>
       </w:pPr>
@@ -538,7 +565,12 @@
     </w:p>
     <w:p>
       <w:pPr>
-        <w:spacing w:after="120" w:line="276"/>
+        <w:pStyle w:val="ListParagraph"/>
+        <w:numPr>
+          <w:ilvl w:val="0"/>
+          <w:numId w:val="1"/>
+        </w:numPr>
+        <w:spacing w:after="60" w:line="276"/>
         <w:ind w:left="360"/>
         <w:jc w:val="both"/>
       </w:pPr>
@@ -563,7 +595,12 @@
     </w:p>
     <w:p>
       <w:pPr>
-        <w:spacing w:after="120" w:line="276"/>
+        <w:pStyle w:val="ListParagraph"/>
+        <w:numPr>
+          <w:ilvl w:val="0"/>
+          <w:numId w:val="1"/>
+        </w:numPr>
+        <w:spacing w:after="60" w:line="276"/>
         <w:ind w:left="360"/>
         <w:jc w:val="both"/>
       </w:pPr>
@@ -602,7 +639,7 @@
     </w:p>
     <w:p>
       <w:pPr>
-        <w:spacing w:after="120" w:before="240"/>
+        <w:spacing w:after="120" w:before="240" w:line="276"/>
       </w:pPr>
       <w:r>
         <w:rPr>
@@ -617,7 +654,7 @@
     </w:p>
     <w:p>
       <w:pPr>
-        <w:spacing w:after="100" w:before="200"/>
+        <w:spacing w:after="100" w:before="200" w:line="276"/>
       </w:pPr>
       <w:r>
         <w:rPr>
@@ -646,7 +683,7 @@
     </w:p>
     <w:p>
       <w:pPr>
-        <w:spacing w:after="100" w:before="200"/>
+        <w:spacing w:after="100" w:before="200" w:line="276"/>
       </w:pPr>
       <w:r>
         <w:rPr>
@@ -686,68 +723,68 @@
           <w:sz w:val="20"/>
           <w:szCs w:val="20"/>
         </w:rPr>
-        <w:t xml:space="preserve">Invariance family. </w:t>
-      </w:r>
-      <w:r>
-        <w:rPr>
-          <w:rFonts w:ascii="Calibri" w:cs="Calibri" w:eastAsia="Calibri" w:hAnsi="Calibri"/>
-          <w:sz w:val="20"/>
-          <w:szCs w:val="20"/>
-        </w:rPr>
-        <w:t xml:space="preserve">Synonym substitution replaces content words (nouns, verbs, adjectives) with WordNet synonyms, producing up to two variants per answer. Synonyms are selected deterministically (alphabetically sorted) to ensure reproducibility. Typo insertion introduces a single character-level modification (adjacent swap, deletion, or duplication) into one content word.</w:t>
-      </w:r>
-    </w:p>
-    <w:p>
-      <w:pPr>
-        <w:spacing w:after="120" w:line="276"/>
-        <w:jc w:val="both"/>
-      </w:pPr>
-      <w:r>
-        <w:rPr>
-          <w:rFonts w:ascii="Calibri" w:cs="Calibri" w:eastAsia="Calibri" w:hAnsi="Calibri"/>
-          <w:b/>
-          <w:bCs/>
-          <w:sz w:val="20"/>
-          <w:szCs w:val="20"/>
-        </w:rPr>
-        <w:t xml:space="preserve">Sensitivity family. </w:t>
-      </w:r>
-      <w:r>
-        <w:rPr>
-          <w:rFonts w:ascii="Calibri" w:cs="Calibri" w:eastAsia="Calibri" w:hAnsi="Calibri"/>
-          <w:sz w:val="20"/>
-          <w:szCs w:val="20"/>
-        </w:rPr>
-        <w:t xml:space="preserve">Negation insertion adds “not” after auxiliary verbs or prepends “It is not true that” as a fallback. Key concept deletion removes one domain-relevant content word selected via seeded random sampling. Semantic contradiction replaces domain terms with curated antonyms (e.g., “open” → “closed”, “series” → “parallel”) drawn from a 40-pair dictionary covering physics and biology vocabulary.</w:t>
-      </w:r>
-    </w:p>
-    <w:p>
-      <w:pPr>
-        <w:spacing w:after="120" w:line="276"/>
-        <w:jc w:val="both"/>
-      </w:pPr>
-      <w:r>
-        <w:rPr>
-          <w:rFonts w:ascii="Calibri" w:cs="Calibri" w:eastAsia="Calibri" w:hAnsi="Calibri"/>
-          <w:b/>
-          <w:bCs/>
-          <w:sz w:val="20"/>
-          <w:szCs w:val="20"/>
-        </w:rPr>
-        <w:t xml:space="preserve">Gaming family. </w:t>
-      </w:r>
-      <w:r>
-        <w:rPr>
-          <w:rFonts w:ascii="Calibri" w:cs="Calibri" w:eastAsia="Calibri" w:hAnsi="Calibri"/>
-          <w:sz w:val="20"/>
-          <w:szCs w:val="20"/>
-        </w:rPr>
-        <w:t xml:space="preserve">Rubric keyword echoing appends reference-answer keywords absent from the student response, simulating keyword stuffing. Fluent wrong extension appends a confident but factually incorrect domain statement from a curated pool of 30 plausible-sounding misconceptions.</w:t>
-      </w:r>
-    </w:p>
-    <w:p>
-      <w:pPr>
-        <w:spacing w:after="100" w:before="200"/>
+        <w:t xml:space="preserve">Invariance family.</w:t>
+      </w:r>
+      <w:r>
+        <w:rPr>
+          <w:rFonts w:ascii="Calibri" w:cs="Calibri" w:eastAsia="Calibri" w:hAnsi="Calibri"/>
+          <w:sz w:val="20"/>
+          <w:szCs w:val="20"/>
+        </w:rPr>
+        <w:t xml:space="preserve"> Synonym substitution replaces content words (nouns, verbs, adjectives) with WordNet synonyms, producing up to two variants per answer. Synonyms are selected deterministically (alphabetically sorted) to ensure reproducibility. Typo insertion introduces a single character-level modification (adjacent swap, deletion, or duplication) into one content word.</w:t>
+      </w:r>
+    </w:p>
+    <w:p>
+      <w:pPr>
+        <w:spacing w:after="120" w:line="276"/>
+        <w:jc w:val="both"/>
+      </w:pPr>
+      <w:r>
+        <w:rPr>
+          <w:rFonts w:ascii="Calibri" w:cs="Calibri" w:eastAsia="Calibri" w:hAnsi="Calibri"/>
+          <w:b/>
+          <w:bCs/>
+          <w:sz w:val="20"/>
+          <w:szCs w:val="20"/>
+        </w:rPr>
+        <w:t xml:space="preserve">Sensitivity family.</w:t>
+      </w:r>
+      <w:r>
+        <w:rPr>
+          <w:rFonts w:ascii="Calibri" w:cs="Calibri" w:eastAsia="Calibri" w:hAnsi="Calibri"/>
+          <w:sz w:val="20"/>
+          <w:szCs w:val="20"/>
+        </w:rPr>
+        <w:t xml:space="preserve"> Negation insertion adds “not” after auxiliary verbs or prepends “It is not true that” as a fallback. Key concept deletion removes one domain-relevant content word selected via seeded random sampling. Semantic contradiction replaces domain terms with curated antonyms (e.g., “open” → “closed”, “series” → “parallel”) drawn from a 40-pair dictionary covering physics and biology vocabulary.</w:t>
+      </w:r>
+    </w:p>
+    <w:p>
+      <w:pPr>
+        <w:spacing w:after="120" w:line="276"/>
+        <w:jc w:val="both"/>
+      </w:pPr>
+      <w:r>
+        <w:rPr>
+          <w:rFonts w:ascii="Calibri" w:cs="Calibri" w:eastAsia="Calibri" w:hAnsi="Calibri"/>
+          <w:b/>
+          <w:bCs/>
+          <w:sz w:val="20"/>
+          <w:szCs w:val="20"/>
+        </w:rPr>
+        <w:t xml:space="preserve">Gaming family.</w:t>
+      </w:r>
+      <w:r>
+        <w:rPr>
+          <w:rFonts w:ascii="Calibri" w:cs="Calibri" w:eastAsia="Calibri" w:hAnsi="Calibri"/>
+          <w:sz w:val="20"/>
+          <w:szCs w:val="20"/>
+        </w:rPr>
+        <w:t xml:space="preserve"> Rubric keyword echoing appends reference-answer keywords absent from the student response, simulating keyword stuffing. Fluent wrong extension appends a confident but factually incorrect domain statement from a curated pool of 30 plausible-sounding misconceptions.</w:t>
+      </w:r>
+    </w:p>
+    <w:p>
+      <w:pPr>
+        <w:spacing w:after="100" w:before="200" w:line="276"/>
       </w:pPr>
       <w:r>
         <w:rPr>
@@ -776,7 +813,7 @@
     </w:p>
     <w:p>
       <w:pPr>
-        <w:spacing w:after="100" w:before="200"/>
+        <w:spacing w:after="100" w:before="200" w:line="276"/>
       </w:pPr>
       <w:r>
         <w:rPr>
@@ -915,7 +952,7 @@
     </w:p>
     <w:p>
       <w:pPr>
-        <w:spacing w:after="100" w:before="200"/>
+        <w:spacing w:after="100" w:before="200" w:line="276"/>
       </w:pPr>
       <w:r>
         <w:rPr>
@@ -1027,20 +1064,20 @@
           <w:sz w:val="20"/>
           <w:szCs w:val="20"/>
         </w:rPr>
-        <w:t xml:space="preserve">Applicability to zero-shot graders. </w:t>
-      </w:r>
-      <w:r>
-        <w:rPr>
-          <w:rFonts w:ascii="Calibri" w:cs="Calibri" w:eastAsia="Calibri" w:hAnsi="Calibri"/>
-          <w:sz w:val="20"/>
-          <w:szCs w:val="20"/>
-        </w:rPr>
-        <w:t xml:space="preserve">The dual-protocol distinction is meaningful only for graders with a training phase. Zero-shot LLM graders receive an identical prompt regardless of how the data is split — they have no mechanism to internalise question-specific patterns from a training set. Consequently, their Protocol A and Protocol B results are expected to be statistically equivalent, differing only by sampling noise from the data partition. Rather than reporting a tautological drop of approximately zero, we evaluate LLM graders on their absolute robustness metrics and compare them directly against the trained baseline’s Protocol A results — the most demanding evaluation condition.</w:t>
-      </w:r>
-    </w:p>
-    <w:p>
-      <w:pPr>
-        <w:spacing w:after="120" w:before="240"/>
+        <w:t xml:space="preserve">Applicability to zero-shot graders.</w:t>
+      </w:r>
+      <w:r>
+        <w:rPr>
+          <w:rFonts w:ascii="Calibri" w:cs="Calibri" w:eastAsia="Calibri" w:hAnsi="Calibri"/>
+          <w:sz w:val="20"/>
+          <w:szCs w:val="20"/>
+        </w:rPr>
+        <w:t xml:space="preserve"> The dual-protocol distinction is meaningful only for graders with a training phase. Zero-shot LLM graders receive an identical prompt regardless of how the data is split — they have no mechanism to internalise question-specific patterns from a training set. Consequently, their Protocol A and Protocol B results are expected to be statistically equivalent, differing only by sampling noise from the data partition. Rather than reporting a tautological drop of approximately zero, we evaluate LLM graders on their absolute robustness metrics and compare them directly against the trained baseline’s Protocol A results — the most demanding evaluation condition.</w:t>
+      </w:r>
+    </w:p>
+    <w:p>
+      <w:pPr>
+        <w:spacing w:after="120" w:before="240" w:line="276"/>
       </w:pPr>
       <w:r>
         <w:rPr>
@@ -1055,7 +1092,7 @@
     </w:p>
     <w:p>
       <w:pPr>
-        <w:spacing w:after="100" w:before="200"/>
+        <w:spacing w:after="100" w:before="200" w:line="276"/>
       </w:pPr>
       <w:r>
         <w:rPr>
@@ -1084,7 +1121,7 @@
     </w:p>
     <w:p>
       <w:pPr>
-        <w:spacing w:after="100" w:before="200"/>
+        <w:spacing w:after="100" w:before="200" w:line="276"/>
       </w:pPr>
       <w:r>
         <w:rPr>
@@ -1110,44 +1147,44 @@
           <w:sz w:val="20"/>
           <w:szCs w:val="20"/>
         </w:rPr>
-        <w:t xml:space="preserve">Hybrid ML baseline. </w:t>
-      </w:r>
-      <w:r>
-        <w:rPr>
-          <w:rFonts w:ascii="Calibri" w:cs="Calibri" w:eastAsia="Calibri" w:hAnsi="Calibri"/>
-          <w:sz w:val="20"/>
-          <w:szCs w:val="20"/>
-        </w:rPr>
-        <w:t xml:space="preserve">A logistic regression classifier trained on 388-dimensional feature vectors: four handcrafted linguistic features (lexical overlap, length ratio, negation flag, reference-token recall) concatenated with 384-dimensional sentence-BERT embeddings (Reimers and Gurevych, 2019; specifically, the all-MiniLM-L6-v2 model). Class weights are balanced to handle label imbalance. This configuration is broadly representative of strong feature-based ASAG baselines reported in the literature (Sung et al., 2019; Condor et al., 2021).</w:t>
-      </w:r>
-    </w:p>
-    <w:p>
-      <w:pPr>
-        <w:spacing w:after="120" w:line="276"/>
-        <w:jc w:val="both"/>
-      </w:pPr>
-      <w:r>
-        <w:rPr>
-          <w:rFonts w:ascii="Calibri" w:cs="Calibri" w:eastAsia="Calibri" w:hAnsi="Calibri"/>
-          <w:b/>
-          <w:bCs/>
-          <w:sz w:val="20"/>
-          <w:szCs w:val="20"/>
-        </w:rPr>
-        <w:t xml:space="preserve">LLM grader. </w:t>
-      </w:r>
-      <w:r>
-        <w:rPr>
-          <w:rFonts w:ascii="Calibri" w:cs="Calibri" w:eastAsia="Calibri" w:hAnsi="Calibri"/>
-          <w:sz w:val="20"/>
-          <w:szCs w:val="20"/>
-        </w:rPr>
-        <w:t xml:space="preserve">Zero-shot prompting of GPT-5.4 mini, evaluated at two information levels. Level 0 supplies the question and the student answer only; Level 1 additionally supplies the reference answer and instructs the model to compare the student response against it. Temperature is set to 0.0 for near-deterministic output, with a fixed seed for reproducibility. The model outputs a JSON object with a label and a confidence score; labels are mapped to the same [0, 1] scale as the gold labels. Because the LLM operates in a zero-shot regime with no task-specific training, the dual-protocol distinction does not alter its input; it is evaluated once and compared against the HybridGrader’s Protocol A (cross-question) results.</w:t>
-      </w:r>
-    </w:p>
-    <w:p>
-      <w:pPr>
-        <w:spacing w:after="100" w:before="200"/>
+        <w:t xml:space="preserve">Hybrid ML baseline.</w:t>
+      </w:r>
+      <w:r>
+        <w:rPr>
+          <w:rFonts w:ascii="Calibri" w:cs="Calibri" w:eastAsia="Calibri" w:hAnsi="Calibri"/>
+          <w:sz w:val="20"/>
+          <w:szCs w:val="20"/>
+        </w:rPr>
+        <w:t xml:space="preserve"> A logistic regression classifier trained on 388-dimensional feature vectors: four handcrafted linguistic features (lexical overlap, length ratio, negation flag, reference-token recall) concatenated with 384-dimensional sentence-BERT embeddings (Reimers and Gurevych, 2019; specifically, the all-MiniLM-L6-v2 model). Class weights are balanced to handle label imbalance. This configuration is broadly representative of strong feature-based ASAG baselines reported in the literature (Sung et al., 2019; Condor et al., 2021).</w:t>
+      </w:r>
+    </w:p>
+    <w:p>
+      <w:pPr>
+        <w:spacing w:after="120" w:line="276"/>
+        <w:jc w:val="both"/>
+      </w:pPr>
+      <w:r>
+        <w:rPr>
+          <w:rFonts w:ascii="Calibri" w:cs="Calibri" w:eastAsia="Calibri" w:hAnsi="Calibri"/>
+          <w:b/>
+          <w:bCs/>
+          <w:sz w:val="20"/>
+          <w:szCs w:val="20"/>
+        </w:rPr>
+        <w:t xml:space="preserve">LLM grader.</w:t>
+      </w:r>
+      <w:r>
+        <w:rPr>
+          <w:rFonts w:ascii="Calibri" w:cs="Calibri" w:eastAsia="Calibri" w:hAnsi="Calibri"/>
+          <w:sz w:val="20"/>
+          <w:szCs w:val="20"/>
+        </w:rPr>
+        <w:t xml:space="preserve"> Zero-shot prompting of GPT-5.4 mini, evaluated at two information levels. Level 0 supplies the question and the student answer only; Level 1 additionally supplies the reference answer and instructs the model to compare the student response against it. Temperature is set to 0.0 for near-deterministic output, with a fixed seed for reproducibility. The model outputs a JSON object with a label and a confidence score; labels are mapped to the same [0, 1] scale as the gold labels. Because the LLM operates in a zero-shot regime with no task-specific training, the dual-protocol distinction does not alter its input; it is evaluated once and compared against the HybridGrader’s Protocol A (cross-question) results.</w:t>
+      </w:r>
+    </w:p>
+    <w:p>
+      <w:pPr>
+        <w:spacing w:after="100" w:before="200" w:line="276"/>
       </w:pPr>
       <w:r>
         <w:rPr>
@@ -1176,7 +1213,7 @@
     </w:p>
     <w:p>
       <w:pPr>
-        <w:spacing w:after="120" w:before="240"/>
+        <w:spacing w:after="120" w:before="240" w:line="276"/>
       </w:pPr>
       <w:r>
         <w:rPr>
@@ -1205,7 +1242,7 @@
     </w:p>
     <w:p>
       <w:pPr>
-        <w:spacing w:after="100" w:before="200"/>
+        <w:spacing w:after="100" w:before="200" w:line="276"/>
       </w:pPr>
       <w:r>
         <w:rPr>
@@ -1234,7 +1271,7 @@
     </w:p>
     <w:p>
       <w:pPr>
-        <w:spacing w:after="60" w:before="120"/>
+        <w:spacing w:after="100" w:before="200" w:line="276"/>
         <w:jc w:val="center"/>
       </w:pPr>
       <w:r>
@@ -1252,7 +1289,7 @@
     </w:p>
     <w:tbl>
       <w:tblPr>
-        <w:tblW w:type="dxa" w:w="9026"/>
+        <w:tblW w:type="dxa" w:w="9000"/>
         <w:tblBorders>
           <w:top w:val="single" w:color="auto" w:sz="4"/>
           <w:left w:val="single" w:color="auto" w:sz="4"/>
@@ -1261,33 +1298,38 @@
           <w:insideH w:val="single" w:color="auto" w:sz="4"/>
           <w:insideV w:val="single" w:color="auto" w:sz="4"/>
         </w:tblBorders>
+        <w:tblLayout w:type="fixed"/>
       </w:tblPr>
       <w:tblGrid>
-        <w:gridCol w:w="2800"/>
-        <w:gridCol w:w="2200"/>
-        <w:gridCol w:w="2200"/>
-        <w:gridCol w:w="1826"/>
+        <w:gridCol w:w="2600"/>
+        <w:gridCol w:w="2400"/>
+        <w:gridCol w:w="2400"/>
+        <w:gridCol w:w="1600"/>
       </w:tblGrid>
       <w:tr>
-        <w:tc>
-          <w:tcPr>
-            <w:tcW w:type="dxa" w:w="2800"/>
-            <w:tcBorders>
-              <w:top w:val="single" w:color="000000" w:sz="1"/>
-              <w:left w:val="single" w:color="000000" w:sz="1"/>
-              <w:bottom w:val="single" w:color="000000" w:sz="1"/>
-              <w:right w:val="single" w:color="000000" w:sz="1"/>
-            </w:tcBorders>
-            <w:shd w:fill="D9E2F3" w:val="clear"/>
-            <w:tcMar>
-              <w:top w:type="dxa" w:w="40"/>
-              <w:left w:type="dxa" w:w="80"/>
-              <w:bottom w:type="dxa" w:w="40"/>
-              <w:right w:type="dxa" w:w="80"/>
-            </w:tcMar>
-          </w:tcPr>
-          <w:p>
-            <w:pPr>
+        <w:trPr>
+          <w:tblHeader/>
+        </w:trPr>
+        <w:tc>
+          <w:tcPr>
+            <w:tcW w:type="dxa" w:w="2600"/>
+            <w:tcBorders>
+              <w:top w:val="single" w:color="000000" w:sz="1"/>
+              <w:left w:val="single" w:color="000000" w:sz="1"/>
+              <w:bottom w:val="single" w:color="000000" w:sz="1"/>
+              <w:right w:val="single" w:color="000000" w:sz="1"/>
+            </w:tcBorders>
+            <w:shd w:fill="D9E2F3" w:color="auto" w:val="clear"/>
+            <w:tcMar>
+              <w:top w:type="dxa" w:w="40"/>
+              <w:left w:type="dxa" w:w="80"/>
+              <w:bottom w:type="dxa" w:w="40"/>
+              <w:right w:type="dxa" w:w="80"/>
+            </w:tcMar>
+          </w:tcPr>
+          <w:p>
+            <w:pPr>
+              <w:spacing w:line="276"/>
               <w:jc w:val="center"/>
             </w:pPr>
             <w:r>
@@ -1304,23 +1346,24 @@
         </w:tc>
         <w:tc>
           <w:tcPr>
-            <w:tcW w:type="dxa" w:w="2200"/>
-            <w:tcBorders>
-              <w:top w:val="single" w:color="000000" w:sz="1"/>
-              <w:left w:val="single" w:color="000000" w:sz="1"/>
-              <w:bottom w:val="single" w:color="000000" w:sz="1"/>
-              <w:right w:val="single" w:color="000000" w:sz="1"/>
-            </w:tcBorders>
-            <w:shd w:fill="D9E2F3" w:val="clear"/>
-            <w:tcMar>
-              <w:top w:type="dxa" w:w="40"/>
-              <w:left w:type="dxa" w:w="80"/>
-              <w:bottom w:type="dxa" w:w="40"/>
-              <w:right w:type="dxa" w:w="80"/>
-            </w:tcMar>
-          </w:tcPr>
-          <w:p>
-            <w:pPr>
+            <w:tcW w:type="dxa" w:w="2400"/>
+            <w:tcBorders>
+              <w:top w:val="single" w:color="000000" w:sz="1"/>
+              <w:left w:val="single" w:color="000000" w:sz="1"/>
+              <w:bottom w:val="single" w:color="000000" w:sz="1"/>
+              <w:right w:val="single" w:color="000000" w:sz="1"/>
+            </w:tcBorders>
+            <w:shd w:fill="D9E2F3" w:color="auto" w:val="clear"/>
+            <w:tcMar>
+              <w:top w:type="dxa" w:w="40"/>
+              <w:left w:type="dxa" w:w="80"/>
+              <w:bottom w:type="dxa" w:w="40"/>
+              <w:right w:type="dxa" w:w="80"/>
+            </w:tcMar>
+          </w:tcPr>
+          <w:p>
+            <w:pPr>
+              <w:spacing w:line="276"/>
               <w:jc w:val="center"/>
             </w:pPr>
             <w:r>
@@ -1337,23 +1380,24 @@
         </w:tc>
         <w:tc>
           <w:tcPr>
-            <w:tcW w:type="dxa" w:w="2200"/>
-            <w:tcBorders>
-              <w:top w:val="single" w:color="000000" w:sz="1"/>
-              <w:left w:val="single" w:color="000000" w:sz="1"/>
-              <w:bottom w:val="single" w:color="000000" w:sz="1"/>
-              <w:right w:val="single" w:color="000000" w:sz="1"/>
-            </w:tcBorders>
-            <w:shd w:fill="D9E2F3" w:val="clear"/>
-            <w:tcMar>
-              <w:top w:type="dxa" w:w="40"/>
-              <w:left w:type="dxa" w:w="80"/>
-              <w:bottom w:type="dxa" w:w="40"/>
-              <w:right w:type="dxa" w:w="80"/>
-            </w:tcMar>
-          </w:tcPr>
-          <w:p>
-            <w:pPr>
+            <w:tcW w:type="dxa" w:w="2400"/>
+            <w:tcBorders>
+              <w:top w:val="single" w:color="000000" w:sz="1"/>
+              <w:left w:val="single" w:color="000000" w:sz="1"/>
+              <w:bottom w:val="single" w:color="000000" w:sz="1"/>
+              <w:right w:val="single" w:color="000000" w:sz="1"/>
+            </w:tcBorders>
+            <w:shd w:fill="D9E2F3" w:color="auto" w:val="clear"/>
+            <w:tcMar>
+              <w:top w:type="dxa" w:w="40"/>
+              <w:left w:type="dxa" w:w="80"/>
+              <w:bottom w:type="dxa" w:w="40"/>
+              <w:right w:type="dxa" w:w="80"/>
+            </w:tcMar>
+          </w:tcPr>
+          <w:p>
+            <w:pPr>
+              <w:spacing w:line="276"/>
               <w:jc w:val="center"/>
             </w:pPr>
             <w:r>
@@ -1370,23 +1414,24 @@
         </w:tc>
         <w:tc>
           <w:tcPr>
-            <w:tcW w:type="dxa" w:w="1826"/>
-            <w:tcBorders>
-              <w:top w:val="single" w:color="000000" w:sz="1"/>
-              <w:left w:val="single" w:color="000000" w:sz="1"/>
-              <w:bottom w:val="single" w:color="000000" w:sz="1"/>
-              <w:right w:val="single" w:color="000000" w:sz="1"/>
-            </w:tcBorders>
-            <w:shd w:fill="D9E2F3" w:val="clear"/>
-            <w:tcMar>
-              <w:top w:type="dxa" w:w="40"/>
-              <w:left w:type="dxa" w:w="80"/>
-              <w:bottom w:type="dxa" w:w="40"/>
-              <w:right w:type="dxa" w:w="80"/>
-            </w:tcMar>
-          </w:tcPr>
-          <w:p>
-            <w:pPr>
+            <w:tcW w:type="dxa" w:w="1600"/>
+            <w:tcBorders>
+              <w:top w:val="single" w:color="000000" w:sz="1"/>
+              <w:left w:val="single" w:color="000000" w:sz="1"/>
+              <w:bottom w:val="single" w:color="000000" w:sz="1"/>
+              <w:right w:val="single" w:color="000000" w:sz="1"/>
+            </w:tcBorders>
+            <w:shd w:fill="D9E2F3" w:color="auto" w:val="clear"/>
+            <w:tcMar>
+              <w:top w:type="dxa" w:w="40"/>
+              <w:left w:type="dxa" w:w="80"/>
+              <w:bottom w:type="dxa" w:w="40"/>
+              <w:right w:type="dxa" w:w="80"/>
+            </w:tcMar>
+          </w:tcPr>
+          <w:p>
+            <w:pPr>
+              <w:spacing w:line="276"/>
               <w:jc w:val="center"/>
             </w:pPr>
             <w:r>
@@ -1405,22 +1450,23 @@
       <w:tr>
         <w:tc>
           <w:tcPr>
-            <w:tcW w:type="dxa" w:w="2800"/>
-            <w:tcBorders>
-              <w:top w:val="single" w:color="000000" w:sz="1"/>
-              <w:left w:val="single" w:color="000000" w:sz="1"/>
-              <w:bottom w:val="single" w:color="000000" w:sz="1"/>
-              <w:right w:val="single" w:color="000000" w:sz="1"/>
-            </w:tcBorders>
-            <w:tcMar>
-              <w:top w:type="dxa" w:w="40"/>
-              <w:left w:type="dxa" w:w="80"/>
-              <w:bottom w:type="dxa" w:w="40"/>
-              <w:right w:type="dxa" w:w="80"/>
-            </w:tcMar>
-          </w:tcPr>
-          <w:p>
-            <w:pPr>
+            <w:tcW w:type="dxa" w:w="2600"/>
+            <w:tcBorders>
+              <w:top w:val="single" w:color="000000" w:sz="1"/>
+              <w:left w:val="single" w:color="000000" w:sz="1"/>
+              <w:bottom w:val="single" w:color="000000" w:sz="1"/>
+              <w:right w:val="single" w:color="000000" w:sz="1"/>
+            </w:tcBorders>
+            <w:tcMar>
+              <w:top w:type="dxa" w:w="40"/>
+              <w:left w:type="dxa" w:w="80"/>
+              <w:bottom w:type="dxa" w:w="40"/>
+              <w:right w:type="dxa" w:w="80"/>
+            </w:tcMar>
+          </w:tcPr>
+          <w:p>
+            <w:pPr>
+              <w:spacing w:line="276"/>
               <w:jc w:val="left"/>
             </w:pPr>
             <w:r>
@@ -1435,22 +1481,23 @@
         </w:tc>
         <w:tc>
           <w:tcPr>
-            <w:tcW w:type="dxa" w:w="2200"/>
-            <w:tcBorders>
-              <w:top w:val="single" w:color="000000" w:sz="1"/>
-              <w:left w:val="single" w:color="000000" w:sz="1"/>
-              <w:bottom w:val="single" w:color="000000" w:sz="1"/>
-              <w:right w:val="single" w:color="000000" w:sz="1"/>
-            </w:tcBorders>
-            <w:tcMar>
-              <w:top w:type="dxa" w:w="40"/>
-              <w:left w:type="dxa" w:w="80"/>
-              <w:bottom w:type="dxa" w:w="40"/>
-              <w:right w:type="dxa" w:w="80"/>
-            </w:tcMar>
-          </w:tcPr>
-          <w:p>
-            <w:pPr>
+            <w:tcW w:type="dxa" w:w="2400"/>
+            <w:tcBorders>
+              <w:top w:val="single" w:color="000000" w:sz="1"/>
+              <w:left w:val="single" w:color="000000" w:sz="1"/>
+              <w:bottom w:val="single" w:color="000000" w:sz="1"/>
+              <w:right w:val="single" w:color="000000" w:sz="1"/>
+            </w:tcBorders>
+            <w:tcMar>
+              <w:top w:type="dxa" w:w="40"/>
+              <w:left w:type="dxa" w:w="80"/>
+              <w:bottom w:type="dxa" w:w="40"/>
+              <w:right w:type="dxa" w:w="80"/>
+            </w:tcMar>
+          </w:tcPr>
+          <w:p>
+            <w:pPr>
+              <w:spacing w:line="276"/>
               <w:jc w:val="center"/>
             </w:pPr>
             <w:r>
@@ -1465,22 +1512,23 @@
         </w:tc>
         <w:tc>
           <w:tcPr>
-            <w:tcW w:type="dxa" w:w="2200"/>
-            <w:tcBorders>
-              <w:top w:val="single" w:color="000000" w:sz="1"/>
-              <w:left w:val="single" w:color="000000" w:sz="1"/>
-              <w:bottom w:val="single" w:color="000000" w:sz="1"/>
-              <w:right w:val="single" w:color="000000" w:sz="1"/>
-            </w:tcBorders>
-            <w:tcMar>
-              <w:top w:type="dxa" w:w="40"/>
-              <w:left w:type="dxa" w:w="80"/>
-              <w:bottom w:type="dxa" w:w="40"/>
-              <w:right w:type="dxa" w:w="80"/>
-            </w:tcMar>
-          </w:tcPr>
-          <w:p>
-            <w:pPr>
+            <w:tcW w:type="dxa" w:w="2400"/>
+            <w:tcBorders>
+              <w:top w:val="single" w:color="000000" w:sz="1"/>
+              <w:left w:val="single" w:color="000000" w:sz="1"/>
+              <w:bottom w:val="single" w:color="000000" w:sz="1"/>
+              <w:right w:val="single" w:color="000000" w:sz="1"/>
+            </w:tcBorders>
+            <w:tcMar>
+              <w:top w:type="dxa" w:w="40"/>
+              <w:left w:type="dxa" w:w="80"/>
+              <w:bottom w:type="dxa" w:w="40"/>
+              <w:right w:type="dxa" w:w="80"/>
+            </w:tcMar>
+          </w:tcPr>
+          <w:p>
+            <w:pPr>
+              <w:spacing w:line="276"/>
               <w:jc w:val="center"/>
             </w:pPr>
             <w:r>
@@ -1495,22 +1543,23 @@
         </w:tc>
         <w:tc>
           <w:tcPr>
-            <w:tcW w:type="dxa" w:w="1826"/>
-            <w:tcBorders>
-              <w:top w:val="single" w:color="000000" w:sz="1"/>
-              <w:left w:val="single" w:color="000000" w:sz="1"/>
-              <w:bottom w:val="single" w:color="000000" w:sz="1"/>
-              <w:right w:val="single" w:color="000000" w:sz="1"/>
-            </w:tcBorders>
-            <w:tcMar>
-              <w:top w:type="dxa" w:w="40"/>
-              <w:left w:type="dxa" w:w="80"/>
-              <w:bottom w:type="dxa" w:w="40"/>
-              <w:right w:type="dxa" w:w="80"/>
-            </w:tcMar>
-          </w:tcPr>
-          <w:p>
-            <w:pPr>
+            <w:tcW w:type="dxa" w:w="1600"/>
+            <w:tcBorders>
+              <w:top w:val="single" w:color="000000" w:sz="1"/>
+              <w:left w:val="single" w:color="000000" w:sz="1"/>
+              <w:bottom w:val="single" w:color="000000" w:sz="1"/>
+              <w:right w:val="single" w:color="000000" w:sz="1"/>
+            </w:tcBorders>
+            <w:tcMar>
+              <w:top w:type="dxa" w:w="40"/>
+              <w:left w:type="dxa" w:w="80"/>
+              <w:bottom w:type="dxa" w:w="40"/>
+              <w:right w:type="dxa" w:w="80"/>
+            </w:tcMar>
+          </w:tcPr>
+          <w:p>
+            <w:pPr>
+              <w:spacing w:line="276"/>
               <w:jc w:val="center"/>
             </w:pPr>
             <w:r>
@@ -1527,22 +1576,23 @@
       <w:tr>
         <w:tc>
           <w:tcPr>
-            <w:tcW w:type="dxa" w:w="2800"/>
-            <w:tcBorders>
-              <w:top w:val="single" w:color="000000" w:sz="1"/>
-              <w:left w:val="single" w:color="000000" w:sz="1"/>
-              <w:bottom w:val="single" w:color="000000" w:sz="1"/>
-              <w:right w:val="single" w:color="000000" w:sz="1"/>
-            </w:tcBorders>
-            <w:tcMar>
-              <w:top w:type="dxa" w:w="40"/>
-              <w:left w:type="dxa" w:w="80"/>
-              <w:bottom w:type="dxa" w:w="40"/>
-              <w:right w:type="dxa" w:w="80"/>
-            </w:tcMar>
-          </w:tcPr>
-          <w:p>
-            <w:pPr>
+            <w:tcW w:type="dxa" w:w="2600"/>
+            <w:tcBorders>
+              <w:top w:val="single" w:color="000000" w:sz="1"/>
+              <w:left w:val="single" w:color="000000" w:sz="1"/>
+              <w:bottom w:val="single" w:color="000000" w:sz="1"/>
+              <w:right w:val="single" w:color="000000" w:sz="1"/>
+            </w:tcBorders>
+            <w:tcMar>
+              <w:top w:type="dxa" w:w="40"/>
+              <w:left w:type="dxa" w:w="80"/>
+              <w:bottom w:type="dxa" w:w="40"/>
+              <w:right w:type="dxa" w:w="80"/>
+            </w:tcMar>
+          </w:tcPr>
+          <w:p>
+            <w:pPr>
+              <w:spacing w:line="276"/>
               <w:jc w:val="left"/>
             </w:pPr>
             <w:r>
@@ -1557,22 +1607,23 @@
         </w:tc>
         <w:tc>
           <w:tcPr>
-            <w:tcW w:type="dxa" w:w="2200"/>
-            <w:tcBorders>
-              <w:top w:val="single" w:color="000000" w:sz="1"/>
-              <w:left w:val="single" w:color="000000" w:sz="1"/>
-              <w:bottom w:val="single" w:color="000000" w:sz="1"/>
-              <w:right w:val="single" w:color="000000" w:sz="1"/>
-            </w:tcBorders>
-            <w:tcMar>
-              <w:top w:type="dxa" w:w="40"/>
-              <w:left w:type="dxa" w:w="80"/>
-              <w:bottom w:type="dxa" w:w="40"/>
-              <w:right w:type="dxa" w:w="80"/>
-            </w:tcMar>
-          </w:tcPr>
-          <w:p>
-            <w:pPr>
+            <w:tcW w:type="dxa" w:w="2400"/>
+            <w:tcBorders>
+              <w:top w:val="single" w:color="000000" w:sz="1"/>
+              <w:left w:val="single" w:color="000000" w:sz="1"/>
+              <w:bottom w:val="single" w:color="000000" w:sz="1"/>
+              <w:right w:val="single" w:color="000000" w:sz="1"/>
+            </w:tcBorders>
+            <w:tcMar>
+              <w:top w:type="dxa" w:w="40"/>
+              <w:left w:type="dxa" w:w="80"/>
+              <w:bottom w:type="dxa" w:w="40"/>
+              <w:right w:type="dxa" w:w="80"/>
+            </w:tcMar>
+          </w:tcPr>
+          <w:p>
+            <w:pPr>
+              <w:spacing w:line="276"/>
               <w:jc w:val="center"/>
             </w:pPr>
             <w:r>
@@ -1587,22 +1638,23 @@
         </w:tc>
         <w:tc>
           <w:tcPr>
-            <w:tcW w:type="dxa" w:w="2200"/>
-            <w:tcBorders>
-              <w:top w:val="single" w:color="000000" w:sz="1"/>
-              <w:left w:val="single" w:color="000000" w:sz="1"/>
-              <w:bottom w:val="single" w:color="000000" w:sz="1"/>
-              <w:right w:val="single" w:color="000000" w:sz="1"/>
-            </w:tcBorders>
-            <w:tcMar>
-              <w:top w:type="dxa" w:w="40"/>
-              <w:left w:type="dxa" w:w="80"/>
-              <w:bottom w:type="dxa" w:w="40"/>
-              <w:right w:type="dxa" w:w="80"/>
-            </w:tcMar>
-          </w:tcPr>
-          <w:p>
-            <w:pPr>
+            <w:tcW w:type="dxa" w:w="2400"/>
+            <w:tcBorders>
+              <w:top w:val="single" w:color="000000" w:sz="1"/>
+              <w:left w:val="single" w:color="000000" w:sz="1"/>
+              <w:bottom w:val="single" w:color="000000" w:sz="1"/>
+              <w:right w:val="single" w:color="000000" w:sz="1"/>
+            </w:tcBorders>
+            <w:tcMar>
+              <w:top w:type="dxa" w:w="40"/>
+              <w:left w:type="dxa" w:w="80"/>
+              <w:bottom w:type="dxa" w:w="40"/>
+              <w:right w:type="dxa" w:w="80"/>
+            </w:tcMar>
+          </w:tcPr>
+          <w:p>
+            <w:pPr>
+              <w:spacing w:line="276"/>
               <w:jc w:val="center"/>
             </w:pPr>
             <w:r>
@@ -1617,22 +1669,23 @@
         </w:tc>
         <w:tc>
           <w:tcPr>
-            <w:tcW w:type="dxa" w:w="1826"/>
-            <w:tcBorders>
-              <w:top w:val="single" w:color="000000" w:sz="1"/>
-              <w:left w:val="single" w:color="000000" w:sz="1"/>
-              <w:bottom w:val="single" w:color="000000" w:sz="1"/>
-              <w:right w:val="single" w:color="000000" w:sz="1"/>
-            </w:tcBorders>
-            <w:tcMar>
-              <w:top w:type="dxa" w:w="40"/>
-              <w:left w:type="dxa" w:w="80"/>
-              <w:bottom w:type="dxa" w:w="40"/>
-              <w:right w:type="dxa" w:w="80"/>
-            </w:tcMar>
-          </w:tcPr>
-          <w:p>
-            <w:pPr>
+            <w:tcW w:type="dxa" w:w="1600"/>
+            <w:tcBorders>
+              <w:top w:val="single" w:color="000000" w:sz="1"/>
+              <w:left w:val="single" w:color="000000" w:sz="1"/>
+              <w:bottom w:val="single" w:color="000000" w:sz="1"/>
+              <w:right w:val="single" w:color="000000" w:sz="1"/>
+            </w:tcBorders>
+            <w:tcMar>
+              <w:top w:type="dxa" w:w="40"/>
+              <w:left w:type="dxa" w:w="80"/>
+              <w:bottom w:type="dxa" w:w="40"/>
+              <w:right w:type="dxa" w:w="80"/>
+            </w:tcMar>
+          </w:tcPr>
+          <w:p>
+            <w:pPr>
+              <w:spacing w:line="276"/>
               <w:jc w:val="center"/>
             </w:pPr>
             <w:r>
@@ -1649,22 +1702,23 @@
       <w:tr>
         <w:tc>
           <w:tcPr>
-            <w:tcW w:type="dxa" w:w="2800"/>
-            <w:tcBorders>
-              <w:top w:val="single" w:color="000000" w:sz="1"/>
-              <w:left w:val="single" w:color="000000" w:sz="1"/>
-              <w:bottom w:val="single" w:color="000000" w:sz="1"/>
-              <w:right w:val="single" w:color="000000" w:sz="1"/>
-            </w:tcBorders>
-            <w:tcMar>
-              <w:top w:type="dxa" w:w="40"/>
-              <w:left w:type="dxa" w:w="80"/>
-              <w:bottom w:type="dxa" w:w="40"/>
-              <w:right w:type="dxa" w:w="80"/>
-            </w:tcMar>
-          </w:tcPr>
-          <w:p>
-            <w:pPr>
+            <w:tcW w:type="dxa" w:w="2600"/>
+            <w:tcBorders>
+              <w:top w:val="single" w:color="000000" w:sz="1"/>
+              <w:left w:val="single" w:color="000000" w:sz="1"/>
+              <w:bottom w:val="single" w:color="000000" w:sz="1"/>
+              <w:right w:val="single" w:color="000000" w:sz="1"/>
+            </w:tcBorders>
+            <w:tcMar>
+              <w:top w:type="dxa" w:w="40"/>
+              <w:left w:type="dxa" w:w="80"/>
+              <w:bottom w:type="dxa" w:w="40"/>
+              <w:right w:type="dxa" w:w="80"/>
+            </w:tcMar>
+          </w:tcPr>
+          <w:p>
+            <w:pPr>
+              <w:spacing w:line="276"/>
               <w:jc w:val="left"/>
             </w:pPr>
             <w:r>
@@ -1679,22 +1733,23 @@
         </w:tc>
         <w:tc>
           <w:tcPr>
-            <w:tcW w:type="dxa" w:w="2200"/>
-            <w:tcBorders>
-              <w:top w:val="single" w:color="000000" w:sz="1"/>
-              <w:left w:val="single" w:color="000000" w:sz="1"/>
-              <w:bottom w:val="single" w:color="000000" w:sz="1"/>
-              <w:right w:val="single" w:color="000000" w:sz="1"/>
-            </w:tcBorders>
-            <w:tcMar>
-              <w:top w:type="dxa" w:w="40"/>
-              <w:left w:type="dxa" w:w="80"/>
-              <w:bottom w:type="dxa" w:w="40"/>
-              <w:right w:type="dxa" w:w="80"/>
-            </w:tcMar>
-          </w:tcPr>
-          <w:p>
-            <w:pPr>
+            <w:tcW w:type="dxa" w:w="2400"/>
+            <w:tcBorders>
+              <w:top w:val="single" w:color="000000" w:sz="1"/>
+              <w:left w:val="single" w:color="000000" w:sz="1"/>
+              <w:bottom w:val="single" w:color="000000" w:sz="1"/>
+              <w:right w:val="single" w:color="000000" w:sz="1"/>
+            </w:tcBorders>
+            <w:tcMar>
+              <w:top w:type="dxa" w:w="40"/>
+              <w:left w:type="dxa" w:w="80"/>
+              <w:bottom w:type="dxa" w:w="40"/>
+              <w:right w:type="dxa" w:w="80"/>
+            </w:tcMar>
+          </w:tcPr>
+          <w:p>
+            <w:pPr>
+              <w:spacing w:line="276"/>
               <w:jc w:val="center"/>
             </w:pPr>
             <w:r>
@@ -1709,22 +1764,23 @@
         </w:tc>
         <w:tc>
           <w:tcPr>
-            <w:tcW w:type="dxa" w:w="2200"/>
-            <w:tcBorders>
-              <w:top w:val="single" w:color="000000" w:sz="1"/>
-              <w:left w:val="single" w:color="000000" w:sz="1"/>
-              <w:bottom w:val="single" w:color="000000" w:sz="1"/>
-              <w:right w:val="single" w:color="000000" w:sz="1"/>
-            </w:tcBorders>
-            <w:tcMar>
-              <w:top w:type="dxa" w:w="40"/>
-              <w:left w:type="dxa" w:w="80"/>
-              <w:bottom w:type="dxa" w:w="40"/>
-              <w:right w:type="dxa" w:w="80"/>
-            </w:tcMar>
-          </w:tcPr>
-          <w:p>
-            <w:pPr>
+            <w:tcW w:type="dxa" w:w="2400"/>
+            <w:tcBorders>
+              <w:top w:val="single" w:color="000000" w:sz="1"/>
+              <w:left w:val="single" w:color="000000" w:sz="1"/>
+              <w:bottom w:val="single" w:color="000000" w:sz="1"/>
+              <w:right w:val="single" w:color="000000" w:sz="1"/>
+            </w:tcBorders>
+            <w:tcMar>
+              <w:top w:type="dxa" w:w="40"/>
+              <w:left w:type="dxa" w:w="80"/>
+              <w:bottom w:type="dxa" w:w="40"/>
+              <w:right w:type="dxa" w:w="80"/>
+            </w:tcMar>
+          </w:tcPr>
+          <w:p>
+            <w:pPr>
+              <w:spacing w:line="276"/>
               <w:jc w:val="center"/>
             </w:pPr>
             <w:r>
@@ -1739,22 +1795,23 @@
         </w:tc>
         <w:tc>
           <w:tcPr>
-            <w:tcW w:type="dxa" w:w="1826"/>
-            <w:tcBorders>
-              <w:top w:val="single" w:color="000000" w:sz="1"/>
-              <w:left w:val="single" w:color="000000" w:sz="1"/>
-              <w:bottom w:val="single" w:color="000000" w:sz="1"/>
-              <w:right w:val="single" w:color="000000" w:sz="1"/>
-            </w:tcBorders>
-            <w:tcMar>
-              <w:top w:type="dxa" w:w="40"/>
-              <w:left w:type="dxa" w:w="80"/>
-              <w:bottom w:type="dxa" w:w="40"/>
-              <w:right w:type="dxa" w:w="80"/>
-            </w:tcMar>
-          </w:tcPr>
-          <w:p>
-            <w:pPr>
+            <w:tcW w:type="dxa" w:w="1600"/>
+            <w:tcBorders>
+              <w:top w:val="single" w:color="000000" w:sz="1"/>
+              <w:left w:val="single" w:color="000000" w:sz="1"/>
+              <w:bottom w:val="single" w:color="000000" w:sz="1"/>
+              <w:right w:val="single" w:color="000000" w:sz="1"/>
+            </w:tcBorders>
+            <w:tcMar>
+              <w:top w:type="dxa" w:w="40"/>
+              <w:left w:type="dxa" w:w="80"/>
+              <w:bottom w:type="dxa" w:w="40"/>
+              <w:right w:type="dxa" w:w="80"/>
+            </w:tcMar>
+          </w:tcPr>
+          <w:p>
+            <w:pPr>
+              <w:spacing w:line="276"/>
               <w:jc w:val="center"/>
             </w:pPr>
             <w:r>
@@ -1771,22 +1828,23 @@
       <w:tr>
         <w:tc>
           <w:tcPr>
-            <w:tcW w:type="dxa" w:w="2800"/>
-            <w:tcBorders>
-              <w:top w:val="single" w:color="000000" w:sz="1"/>
-              <w:left w:val="single" w:color="000000" w:sz="1"/>
-              <w:bottom w:val="single" w:color="000000" w:sz="1"/>
-              <w:right w:val="single" w:color="000000" w:sz="1"/>
-            </w:tcBorders>
-            <w:tcMar>
-              <w:top w:type="dxa" w:w="40"/>
-              <w:left w:type="dxa" w:w="80"/>
-              <w:bottom w:type="dxa" w:w="40"/>
-              <w:right w:type="dxa" w:w="80"/>
-            </w:tcMar>
-          </w:tcPr>
-          <w:p>
-            <w:pPr>
+            <w:tcW w:type="dxa" w:w="2600"/>
+            <w:tcBorders>
+              <w:top w:val="single" w:color="000000" w:sz="1"/>
+              <w:left w:val="single" w:color="000000" w:sz="1"/>
+              <w:bottom w:val="single" w:color="000000" w:sz="1"/>
+              <w:right w:val="single" w:color="000000" w:sz="1"/>
+            </w:tcBorders>
+            <w:tcMar>
+              <w:top w:type="dxa" w:w="40"/>
+              <w:left w:type="dxa" w:w="80"/>
+              <w:bottom w:type="dxa" w:w="40"/>
+              <w:right w:type="dxa" w:w="80"/>
+            </w:tcMar>
+          </w:tcPr>
+          <w:p>
+            <w:pPr>
+              <w:spacing w:line="276"/>
               <w:jc w:val="left"/>
             </w:pPr>
             <w:r>
@@ -1801,22 +1859,23 @@
         </w:tc>
         <w:tc>
           <w:tcPr>
-            <w:tcW w:type="dxa" w:w="2200"/>
-            <w:tcBorders>
-              <w:top w:val="single" w:color="000000" w:sz="1"/>
-              <w:left w:val="single" w:color="000000" w:sz="1"/>
-              <w:bottom w:val="single" w:color="000000" w:sz="1"/>
-              <w:right w:val="single" w:color="000000" w:sz="1"/>
-            </w:tcBorders>
-            <w:tcMar>
-              <w:top w:type="dxa" w:w="40"/>
-              <w:left w:type="dxa" w:w="80"/>
-              <w:bottom w:type="dxa" w:w="40"/>
-              <w:right w:type="dxa" w:w="80"/>
-            </w:tcMar>
-          </w:tcPr>
-          <w:p>
-            <w:pPr>
+            <w:tcW w:type="dxa" w:w="2400"/>
+            <w:tcBorders>
+              <w:top w:val="single" w:color="000000" w:sz="1"/>
+              <w:left w:val="single" w:color="000000" w:sz="1"/>
+              <w:bottom w:val="single" w:color="000000" w:sz="1"/>
+              <w:right w:val="single" w:color="000000" w:sz="1"/>
+            </w:tcBorders>
+            <w:tcMar>
+              <w:top w:type="dxa" w:w="40"/>
+              <w:left w:type="dxa" w:w="80"/>
+              <w:bottom w:type="dxa" w:w="40"/>
+              <w:right w:type="dxa" w:w="80"/>
+            </w:tcMar>
+          </w:tcPr>
+          <w:p>
+            <w:pPr>
+              <w:spacing w:line="276"/>
               <w:jc w:val="center"/>
             </w:pPr>
             <w:r>
@@ -1831,22 +1890,23 @@
         </w:tc>
         <w:tc>
           <w:tcPr>
-            <w:tcW w:type="dxa" w:w="2200"/>
-            <w:tcBorders>
-              <w:top w:val="single" w:color="000000" w:sz="1"/>
-              <w:left w:val="single" w:color="000000" w:sz="1"/>
-              <w:bottom w:val="single" w:color="000000" w:sz="1"/>
-              <w:right w:val="single" w:color="000000" w:sz="1"/>
-            </w:tcBorders>
-            <w:tcMar>
-              <w:top w:type="dxa" w:w="40"/>
-              <w:left w:type="dxa" w:w="80"/>
-              <w:bottom w:type="dxa" w:w="40"/>
-              <w:right w:type="dxa" w:w="80"/>
-            </w:tcMar>
-          </w:tcPr>
-          <w:p>
-            <w:pPr>
+            <w:tcW w:type="dxa" w:w="2400"/>
+            <w:tcBorders>
+              <w:top w:val="single" w:color="000000" w:sz="1"/>
+              <w:left w:val="single" w:color="000000" w:sz="1"/>
+              <w:bottom w:val="single" w:color="000000" w:sz="1"/>
+              <w:right w:val="single" w:color="000000" w:sz="1"/>
+            </w:tcBorders>
+            <w:tcMar>
+              <w:top w:type="dxa" w:w="40"/>
+              <w:left w:type="dxa" w:w="80"/>
+              <w:bottom w:type="dxa" w:w="40"/>
+              <w:right w:type="dxa" w:w="80"/>
+            </w:tcMar>
+          </w:tcPr>
+          <w:p>
+            <w:pPr>
+              <w:spacing w:line="276"/>
               <w:jc w:val="center"/>
             </w:pPr>
             <w:r>
@@ -1861,22 +1921,23 @@
         </w:tc>
         <w:tc>
           <w:tcPr>
-            <w:tcW w:type="dxa" w:w="1826"/>
-            <w:tcBorders>
-              <w:top w:val="single" w:color="000000" w:sz="1"/>
-              <w:left w:val="single" w:color="000000" w:sz="1"/>
-              <w:bottom w:val="single" w:color="000000" w:sz="1"/>
-              <w:right w:val="single" w:color="000000" w:sz="1"/>
-            </w:tcBorders>
-            <w:tcMar>
-              <w:top w:type="dxa" w:w="40"/>
-              <w:left w:type="dxa" w:w="80"/>
-              <w:bottom w:type="dxa" w:w="40"/>
-              <w:right w:type="dxa" w:w="80"/>
-            </w:tcMar>
-          </w:tcPr>
-          <w:p>
-            <w:pPr>
+            <w:tcW w:type="dxa" w:w="1600"/>
+            <w:tcBorders>
+              <w:top w:val="single" w:color="000000" w:sz="1"/>
+              <w:left w:val="single" w:color="000000" w:sz="1"/>
+              <w:bottom w:val="single" w:color="000000" w:sz="1"/>
+              <w:right w:val="single" w:color="000000" w:sz="1"/>
+            </w:tcBorders>
+            <w:tcMar>
+              <w:top w:type="dxa" w:w="40"/>
+              <w:left w:type="dxa" w:w="80"/>
+              <w:bottom w:type="dxa" w:w="40"/>
+              <w:right w:type="dxa" w:w="80"/>
+            </w:tcMar>
+          </w:tcPr>
+          <w:p>
+            <w:pPr>
+              <w:spacing w:line="276"/>
               <w:jc w:val="center"/>
             </w:pPr>
             <w:r>
@@ -1893,11 +1954,6 @@
     </w:tbl>
     <w:p>
       <w:pPr>
-        <w:spacing w:after="60"/>
-      </w:pPr>
-    </w:p>
-    <w:p>
-      <w:pPr>
         <w:spacing w:after="120" w:line="276"/>
         <w:jc w:val="both"/>
       </w:pPr>
@@ -1921,26 +1977,26 @@
           <w:sz w:val="20"/>
           <w:szCs w:val="20"/>
         </w:rPr>
-        <w:t xml:space="preserve">Sensitivity detection remains low under both protocols (SSR ≈ 0.13), suggesting that the HybridGrader’s inability to detect meaning-altering perturbations is a structural limitation of feature-based scoring rather than a distributional shift effect — it misses negations, concept deletions, and semantic contradictions regardless of whether it has seen the question before.</w:t>
-      </w:r>
-    </w:p>
-    <w:p>
-      <w:pPr>
-        <w:spacing w:after="120" w:line="276"/>
-        <w:jc w:val="both"/>
-      </w:pPr>
-      <w:r>
-        <w:rPr>
-          <w:rFonts w:ascii="Calibri" w:cs="Calibri" w:eastAsia="Calibri" w:hAnsi="Calibri"/>
-          <w:sz w:val="20"/>
-          <w:szCs w:val="20"/>
-        </w:rPr>
-        <w:t xml:space="preserve">These findings demonstrate that within-question evaluations (Protocol B) substantially overestimate the operational robustness of trained ASAG systems. The robustness drop — particularly the +15.8 percentage point increase in IVR_flip and the +7.4 percentage point increase in ASR — quantifies the extent of this overestimation.</w:t>
-      </w:r>
-    </w:p>
-    <w:p>
-      <w:pPr>
-        <w:spacing w:after="100" w:before="200"/>
+        <w:t xml:space="preserve">Sensitivity detection remains low under both protocols (SSR ≈ 0.13), suggesting that the HybridGrader’s inability to detect meaning-altering perturbations is a structural limitation of feature-based scoring rather than a distributional shift effect — it misses negations, concept deletions, and contradictions regardless of whether it has seen the question before.</w:t>
+      </w:r>
+    </w:p>
+    <w:p>
+      <w:pPr>
+        <w:spacing w:after="120" w:line="276"/>
+        <w:jc w:val="both"/>
+      </w:pPr>
+      <w:r>
+        <w:rPr>
+          <w:rFonts w:ascii="Calibri" w:cs="Calibri" w:eastAsia="Calibri" w:hAnsi="Calibri"/>
+          <w:sz w:val="20"/>
+          <w:szCs w:val="20"/>
+        </w:rPr>
+        <w:t xml:space="preserve">These findings demonstrate that within-question evaluations (Protocol B) substantially overestimate the operational robustness of trained ASAG systems. The robustness drop — particularly the +15.8 percentage point increase in IVR_flip and the +7.4 percentage point increase in ASR — quantifies the extent of this overestimation. Standard ASAG benchmarks, which typically report within-question performance, therefore provide an optimistic picture of how a deployed grader will behave on questions it has not been trained on.</w:t>
+      </w:r>
+    </w:p>
+    <w:p>
+      <w:pPr>
+        <w:spacing w:after="100" w:before="200" w:line="276"/>
       </w:pPr>
       <w:r>
         <w:rPr>
@@ -1969,7 +2025,7 @@
     </w:p>
     <w:p>
       <w:pPr>
-        <w:spacing w:after="60" w:before="120"/>
+        <w:spacing w:after="100" w:before="200" w:line="276"/>
         <w:jc w:val="center"/>
       </w:pPr>
       <w:r>
@@ -1982,12 +2038,12 @@
           <w:sz w:val="20"/>
           <w:szCs w:val="20"/>
         </w:rPr>
-        <w:t xml:space="preserve">Table 2. Cross-paradigm robustness comparison.</w:t>
+        <w:t xml:space="preserve">Table 2. Cross-paradigm robustness comparison (HybridGrader at Protocol A; LLM zero-shot, single-run).</w:t>
       </w:r>
     </w:p>
     <w:tbl>
       <w:tblPr>
-        <w:tblW w:type="dxa" w:w="9026"/>
+        <w:tblW w:type="dxa" w:w="9000"/>
         <w:tblBorders>
           <w:top w:val="single" w:color="auto" w:sz="4"/>
           <w:left w:val="single" w:color="auto" w:sz="4"/>
@@ -1996,33 +2052,38 @@
           <w:insideH w:val="single" w:color="auto" w:sz="4"/>
           <w:insideV w:val="single" w:color="auto" w:sz="4"/>
         </w:tblBorders>
+        <w:tblLayout w:type="fixed"/>
       </w:tblPr>
       <w:tblGrid>
-        <w:gridCol w:w="2400"/>
-        <w:gridCol w:w="1900"/>
+        <w:gridCol w:w="2600"/>
+        <w:gridCol w:w="2000"/>
         <w:gridCol w:w="2200"/>
-        <w:gridCol w:w="2526"/>
+        <w:gridCol w:w="2200"/>
       </w:tblGrid>
       <w:tr>
-        <w:tc>
-          <w:tcPr>
-            <w:tcW w:type="dxa" w:w="2400"/>
-            <w:tcBorders>
-              <w:top w:val="single" w:color="000000" w:sz="1"/>
-              <w:left w:val="single" w:color="000000" w:sz="1"/>
-              <w:bottom w:val="single" w:color="000000" w:sz="1"/>
-              <w:right w:val="single" w:color="000000" w:sz="1"/>
-            </w:tcBorders>
-            <w:shd w:fill="D9E2F3" w:val="clear"/>
-            <w:tcMar>
-              <w:top w:type="dxa" w:w="40"/>
-              <w:left w:type="dxa" w:w="80"/>
-              <w:bottom w:type="dxa" w:w="40"/>
-              <w:right w:type="dxa" w:w="80"/>
-            </w:tcMar>
-          </w:tcPr>
-          <w:p>
-            <w:pPr>
+        <w:trPr>
+          <w:tblHeader/>
+        </w:trPr>
+        <w:tc>
+          <w:tcPr>
+            <w:tcW w:type="dxa" w:w="2600"/>
+            <w:tcBorders>
+              <w:top w:val="single" w:color="000000" w:sz="1"/>
+              <w:left w:val="single" w:color="000000" w:sz="1"/>
+              <w:bottom w:val="single" w:color="000000" w:sz="1"/>
+              <w:right w:val="single" w:color="000000" w:sz="1"/>
+            </w:tcBorders>
+            <w:shd w:fill="D9E2F3" w:color="auto" w:val="clear"/>
+            <w:tcMar>
+              <w:top w:type="dxa" w:w="40"/>
+              <w:left w:type="dxa" w:w="80"/>
+              <w:bottom w:type="dxa" w:w="40"/>
+              <w:right w:type="dxa" w:w="80"/>
+            </w:tcMar>
+          </w:tcPr>
+          <w:p>
+            <w:pPr>
+              <w:spacing w:line="276"/>
               <w:jc w:val="center"/>
             </w:pPr>
             <w:r>
@@ -2039,23 +2100,24 @@
         </w:tc>
         <w:tc>
           <w:tcPr>
-            <w:tcW w:type="dxa" w:w="1900"/>
-            <w:tcBorders>
-              <w:top w:val="single" w:color="000000" w:sz="1"/>
-              <w:left w:val="single" w:color="000000" w:sz="1"/>
-              <w:bottom w:val="single" w:color="000000" w:sz="1"/>
-              <w:right w:val="single" w:color="000000" w:sz="1"/>
-            </w:tcBorders>
-            <w:shd w:fill="D9E2F3" w:val="clear"/>
-            <w:tcMar>
-              <w:top w:type="dxa" w:w="40"/>
-              <w:left w:type="dxa" w:w="80"/>
-              <w:bottom w:type="dxa" w:w="40"/>
-              <w:right w:type="dxa" w:w="80"/>
-            </w:tcMar>
-          </w:tcPr>
-          <w:p>
-            <w:pPr>
+            <w:tcW w:type="dxa" w:w="2000"/>
+            <w:tcBorders>
+              <w:top w:val="single" w:color="000000" w:sz="1"/>
+              <w:left w:val="single" w:color="000000" w:sz="1"/>
+              <w:bottom w:val="single" w:color="000000" w:sz="1"/>
+              <w:right w:val="single" w:color="000000" w:sz="1"/>
+            </w:tcBorders>
+            <w:shd w:fill="D9E2F3" w:color="auto" w:val="clear"/>
+            <w:tcMar>
+              <w:top w:type="dxa" w:w="40"/>
+              <w:left w:type="dxa" w:w="80"/>
+              <w:bottom w:type="dxa" w:w="40"/>
+              <w:right w:type="dxa" w:w="80"/>
+            </w:tcMar>
+          </w:tcPr>
+          <w:p>
+            <w:pPr>
+              <w:spacing w:line="276"/>
               <w:jc w:val="center"/>
             </w:pPr>
             <w:r>
@@ -2079,16 +2141,17 @@
               <w:bottom w:val="single" w:color="000000" w:sz="1"/>
               <w:right w:val="single" w:color="000000" w:sz="1"/>
             </w:tcBorders>
-            <w:shd w:fill="D9E2F3" w:val="clear"/>
-            <w:tcMar>
-              <w:top w:type="dxa" w:w="40"/>
-              <w:left w:type="dxa" w:w="80"/>
-              <w:bottom w:type="dxa" w:w="40"/>
-              <w:right w:type="dxa" w:w="80"/>
-            </w:tcMar>
-          </w:tcPr>
-          <w:p>
-            <w:pPr>
+            <w:shd w:fill="D9E2F3" w:color="auto" w:val="clear"/>
+            <w:tcMar>
+              <w:top w:type="dxa" w:w="40"/>
+              <w:left w:type="dxa" w:w="80"/>
+              <w:bottom w:type="dxa" w:w="40"/>
+              <w:right w:type="dxa" w:w="80"/>
+            </w:tcMar>
+          </w:tcPr>
+          <w:p>
+            <w:pPr>
+              <w:spacing w:line="276"/>
               <w:jc w:val="center"/>
             </w:pPr>
             <w:r>
@@ -2105,23 +2168,24 @@
         </w:tc>
         <w:tc>
           <w:tcPr>
-            <w:tcW w:type="dxa" w:w="2526"/>
-            <w:tcBorders>
-              <w:top w:val="single" w:color="000000" w:sz="1"/>
-              <w:left w:val="single" w:color="000000" w:sz="1"/>
-              <w:bottom w:val="single" w:color="000000" w:sz="1"/>
-              <w:right w:val="single" w:color="000000" w:sz="1"/>
-            </w:tcBorders>
-            <w:shd w:fill="D9E2F3" w:val="clear"/>
-            <w:tcMar>
-              <w:top w:type="dxa" w:w="40"/>
-              <w:left w:type="dxa" w:w="80"/>
-              <w:bottom w:type="dxa" w:w="40"/>
-              <w:right w:type="dxa" w:w="80"/>
-            </w:tcMar>
-          </w:tcPr>
-          <w:p>
-            <w:pPr>
+            <w:tcW w:type="dxa" w:w="2200"/>
+            <w:tcBorders>
+              <w:top w:val="single" w:color="000000" w:sz="1"/>
+              <w:left w:val="single" w:color="000000" w:sz="1"/>
+              <w:bottom w:val="single" w:color="000000" w:sz="1"/>
+              <w:right w:val="single" w:color="000000" w:sz="1"/>
+            </w:tcBorders>
+            <w:shd w:fill="D9E2F3" w:color="auto" w:val="clear"/>
+            <w:tcMar>
+              <w:top w:type="dxa" w:w="40"/>
+              <w:left w:type="dxa" w:w="80"/>
+              <w:bottom w:type="dxa" w:w="40"/>
+              <w:right w:type="dxa" w:w="80"/>
+            </w:tcMar>
+          </w:tcPr>
+          <w:p>
+            <w:pPr>
+              <w:spacing w:line="276"/>
               <w:jc w:val="center"/>
             </w:pPr>
             <w:r>
@@ -2140,22 +2204,23 @@
       <w:tr>
         <w:tc>
           <w:tcPr>
-            <w:tcW w:type="dxa" w:w="2400"/>
-            <w:tcBorders>
-              <w:top w:val="single" w:color="000000" w:sz="1"/>
-              <w:left w:val="single" w:color="000000" w:sz="1"/>
-              <w:bottom w:val="single" w:color="000000" w:sz="1"/>
-              <w:right w:val="single" w:color="000000" w:sz="1"/>
-            </w:tcBorders>
-            <w:tcMar>
-              <w:top w:type="dxa" w:w="40"/>
-              <w:left w:type="dxa" w:w="80"/>
-              <w:bottom w:type="dxa" w:w="40"/>
-              <w:right w:type="dxa" w:w="80"/>
-            </w:tcMar>
-          </w:tcPr>
-          <w:p>
-            <w:pPr>
+            <w:tcW w:type="dxa" w:w="2600"/>
+            <w:tcBorders>
+              <w:top w:val="single" w:color="000000" w:sz="1"/>
+              <w:left w:val="single" w:color="000000" w:sz="1"/>
+              <w:bottom w:val="single" w:color="000000" w:sz="1"/>
+              <w:right w:val="single" w:color="000000" w:sz="1"/>
+            </w:tcBorders>
+            <w:tcMar>
+              <w:top w:type="dxa" w:w="40"/>
+              <w:left w:type="dxa" w:w="80"/>
+              <w:bottom w:type="dxa" w:w="40"/>
+              <w:right w:type="dxa" w:w="80"/>
+            </w:tcMar>
+          </w:tcPr>
+          <w:p>
+            <w:pPr>
+              <w:spacing w:line="276"/>
               <w:jc w:val="left"/>
             </w:pPr>
             <w:r>
@@ -2170,22 +2235,23 @@
         </w:tc>
         <w:tc>
           <w:tcPr>
-            <w:tcW w:type="dxa" w:w="1900"/>
-            <w:tcBorders>
-              <w:top w:val="single" w:color="000000" w:sz="1"/>
-              <w:left w:val="single" w:color="000000" w:sz="1"/>
-              <w:bottom w:val="single" w:color="000000" w:sz="1"/>
-              <w:right w:val="single" w:color="000000" w:sz="1"/>
-            </w:tcBorders>
-            <w:tcMar>
-              <w:top w:type="dxa" w:w="40"/>
-              <w:left w:type="dxa" w:w="80"/>
-              <w:bottom w:type="dxa" w:w="40"/>
-              <w:right w:type="dxa" w:w="80"/>
-            </w:tcMar>
-          </w:tcPr>
-          <w:p>
-            <w:pPr>
+            <w:tcW w:type="dxa" w:w="2000"/>
+            <w:tcBorders>
+              <w:top w:val="single" w:color="000000" w:sz="1"/>
+              <w:left w:val="single" w:color="000000" w:sz="1"/>
+              <w:bottom w:val="single" w:color="000000" w:sz="1"/>
+              <w:right w:val="single" w:color="000000" w:sz="1"/>
+            </w:tcBorders>
+            <w:tcMar>
+              <w:top w:type="dxa" w:w="40"/>
+              <w:left w:type="dxa" w:w="80"/>
+              <w:bottom w:type="dxa" w:w="40"/>
+              <w:right w:type="dxa" w:w="80"/>
+            </w:tcMar>
+          </w:tcPr>
+          <w:p>
+            <w:pPr>
+              <w:spacing w:line="276"/>
               <w:jc w:val="center"/>
             </w:pPr>
             <w:r>
@@ -2216,6 +2282,7 @@
           </w:tcPr>
           <w:p>
             <w:pPr>
+              <w:spacing w:line="276"/>
               <w:jc w:val="center"/>
             </w:pPr>
             <w:r>
@@ -2230,27 +2297,30 @@
         </w:tc>
         <w:tc>
           <w:tcPr>
-            <w:tcW w:type="dxa" w:w="2526"/>
-            <w:tcBorders>
-              <w:top w:val="single" w:color="000000" w:sz="1"/>
-              <w:left w:val="single" w:color="000000" w:sz="1"/>
-              <w:bottom w:val="single" w:color="000000" w:sz="1"/>
-              <w:right w:val="single" w:color="000000" w:sz="1"/>
-            </w:tcBorders>
-            <w:tcMar>
-              <w:top w:type="dxa" w:w="40"/>
-              <w:left w:type="dxa" w:w="80"/>
-              <w:bottom w:type="dxa" w:w="40"/>
-              <w:right w:type="dxa" w:w="80"/>
-            </w:tcMar>
-          </w:tcPr>
-          <w:p>
-            <w:pPr>
+            <w:tcW w:type="dxa" w:w="2200"/>
+            <w:tcBorders>
+              <w:top w:val="single" w:color="000000" w:sz="1"/>
+              <w:left w:val="single" w:color="000000" w:sz="1"/>
+              <w:bottom w:val="single" w:color="000000" w:sz="1"/>
+              <w:right w:val="single" w:color="000000" w:sz="1"/>
+            </w:tcBorders>
+            <w:tcMar>
+              <w:top w:type="dxa" w:w="40"/>
+              <w:left w:type="dxa" w:w="80"/>
+              <w:bottom w:type="dxa" w:w="40"/>
+              <w:right w:type="dxa" w:w="80"/>
+            </w:tcMar>
+          </w:tcPr>
+          <w:p>
+            <w:pPr>
+              <w:spacing w:line="276"/>
               <w:jc w:val="center"/>
             </w:pPr>
             <w:r>
               <w:rPr>
                 <w:rFonts w:ascii="Calibri" w:cs="Calibri" w:eastAsia="Calibri" w:hAnsi="Calibri"/>
+                <w:b/>
+                <w:bCs/>
                 <w:sz w:val="20"/>
                 <w:szCs w:val="20"/>
               </w:rPr>
@@ -2262,22 +2332,23 @@
       <w:tr>
         <w:tc>
           <w:tcPr>
-            <w:tcW w:type="dxa" w:w="2400"/>
-            <w:tcBorders>
-              <w:top w:val="single" w:color="000000" w:sz="1"/>
-              <w:left w:val="single" w:color="000000" w:sz="1"/>
-              <w:bottom w:val="single" w:color="000000" w:sz="1"/>
-              <w:right w:val="single" w:color="000000" w:sz="1"/>
-            </w:tcBorders>
-            <w:tcMar>
-              <w:top w:type="dxa" w:w="40"/>
-              <w:left w:type="dxa" w:w="80"/>
-              <w:bottom w:type="dxa" w:w="40"/>
-              <w:right w:type="dxa" w:w="80"/>
-            </w:tcMar>
-          </w:tcPr>
-          <w:p>
-            <w:pPr>
+            <w:tcW w:type="dxa" w:w="2600"/>
+            <w:tcBorders>
+              <w:top w:val="single" w:color="000000" w:sz="1"/>
+              <w:left w:val="single" w:color="000000" w:sz="1"/>
+              <w:bottom w:val="single" w:color="000000" w:sz="1"/>
+              <w:right w:val="single" w:color="000000" w:sz="1"/>
+            </w:tcBorders>
+            <w:tcMar>
+              <w:top w:type="dxa" w:w="40"/>
+              <w:left w:type="dxa" w:w="80"/>
+              <w:bottom w:type="dxa" w:w="40"/>
+              <w:right w:type="dxa" w:w="80"/>
+            </w:tcMar>
+          </w:tcPr>
+          <w:p>
+            <w:pPr>
+              <w:spacing w:line="276"/>
               <w:jc w:val="left"/>
             </w:pPr>
             <w:r>
@@ -2292,22 +2363,23 @@
         </w:tc>
         <w:tc>
           <w:tcPr>
-            <w:tcW w:type="dxa" w:w="1900"/>
-            <w:tcBorders>
-              <w:top w:val="single" w:color="000000" w:sz="1"/>
-              <w:left w:val="single" w:color="000000" w:sz="1"/>
-              <w:bottom w:val="single" w:color="000000" w:sz="1"/>
-              <w:right w:val="single" w:color="000000" w:sz="1"/>
-            </w:tcBorders>
-            <w:tcMar>
-              <w:top w:type="dxa" w:w="40"/>
-              <w:left w:type="dxa" w:w="80"/>
-              <w:bottom w:type="dxa" w:w="40"/>
-              <w:right w:type="dxa" w:w="80"/>
-            </w:tcMar>
-          </w:tcPr>
-          <w:p>
-            <w:pPr>
+            <w:tcW w:type="dxa" w:w="2000"/>
+            <w:tcBorders>
+              <w:top w:val="single" w:color="000000" w:sz="1"/>
+              <w:left w:val="single" w:color="000000" w:sz="1"/>
+              <w:bottom w:val="single" w:color="000000" w:sz="1"/>
+              <w:right w:val="single" w:color="000000" w:sz="1"/>
+            </w:tcBorders>
+            <w:tcMar>
+              <w:top w:type="dxa" w:w="40"/>
+              <w:left w:type="dxa" w:w="80"/>
+              <w:bottom w:type="dxa" w:w="40"/>
+              <w:right w:type="dxa" w:w="80"/>
+            </w:tcMar>
+          </w:tcPr>
+          <w:p>
+            <w:pPr>
+              <w:spacing w:line="276"/>
               <w:jc w:val="center"/>
             </w:pPr>
             <w:r>
@@ -2338,6 +2410,7 @@
           </w:tcPr>
           <w:p>
             <w:pPr>
+              <w:spacing w:line="276"/>
               <w:jc w:val="center"/>
             </w:pPr>
             <w:r>
@@ -2352,27 +2425,30 @@
         </w:tc>
         <w:tc>
           <w:tcPr>
-            <w:tcW w:type="dxa" w:w="2526"/>
-            <w:tcBorders>
-              <w:top w:val="single" w:color="000000" w:sz="1"/>
-              <w:left w:val="single" w:color="000000" w:sz="1"/>
-              <w:bottom w:val="single" w:color="000000" w:sz="1"/>
-              <w:right w:val="single" w:color="000000" w:sz="1"/>
-            </w:tcBorders>
-            <w:tcMar>
-              <w:top w:type="dxa" w:w="40"/>
-              <w:left w:type="dxa" w:w="80"/>
-              <w:bottom w:type="dxa" w:w="40"/>
-              <w:right w:type="dxa" w:w="80"/>
-            </w:tcMar>
-          </w:tcPr>
-          <w:p>
-            <w:pPr>
+            <w:tcW w:type="dxa" w:w="2200"/>
+            <w:tcBorders>
+              <w:top w:val="single" w:color="000000" w:sz="1"/>
+              <w:left w:val="single" w:color="000000" w:sz="1"/>
+              <w:bottom w:val="single" w:color="000000" w:sz="1"/>
+              <w:right w:val="single" w:color="000000" w:sz="1"/>
+            </w:tcBorders>
+            <w:tcMar>
+              <w:top w:type="dxa" w:w="40"/>
+              <w:left w:type="dxa" w:w="80"/>
+              <w:bottom w:type="dxa" w:w="40"/>
+              <w:right w:type="dxa" w:w="80"/>
+            </w:tcMar>
+          </w:tcPr>
+          <w:p>
+            <w:pPr>
+              <w:spacing w:line="276"/>
               <w:jc w:val="center"/>
             </w:pPr>
             <w:r>
               <w:rPr>
                 <w:rFonts w:ascii="Calibri" w:cs="Calibri" w:eastAsia="Calibri" w:hAnsi="Calibri"/>
+                <w:b/>
+                <w:bCs/>
                 <w:sz w:val="20"/>
                 <w:szCs w:val="20"/>
               </w:rPr>
@@ -2384,22 +2460,23 @@
       <w:tr>
         <w:tc>
           <w:tcPr>
-            <w:tcW w:type="dxa" w:w="2400"/>
-            <w:tcBorders>
-              <w:top w:val="single" w:color="000000" w:sz="1"/>
-              <w:left w:val="single" w:color="000000" w:sz="1"/>
-              <w:bottom w:val="single" w:color="000000" w:sz="1"/>
-              <w:right w:val="single" w:color="000000" w:sz="1"/>
-            </w:tcBorders>
-            <w:tcMar>
-              <w:top w:type="dxa" w:w="40"/>
-              <w:left w:type="dxa" w:w="80"/>
-              <w:bottom w:type="dxa" w:w="40"/>
-              <w:right w:type="dxa" w:w="80"/>
-            </w:tcMar>
-          </w:tcPr>
-          <w:p>
-            <w:pPr>
+            <w:tcW w:type="dxa" w:w="2600"/>
+            <w:tcBorders>
+              <w:top w:val="single" w:color="000000" w:sz="1"/>
+              <w:left w:val="single" w:color="000000" w:sz="1"/>
+              <w:bottom w:val="single" w:color="000000" w:sz="1"/>
+              <w:right w:val="single" w:color="000000" w:sz="1"/>
+            </w:tcBorders>
+            <w:tcMar>
+              <w:top w:type="dxa" w:w="40"/>
+              <w:left w:type="dxa" w:w="80"/>
+              <w:bottom w:type="dxa" w:w="40"/>
+              <w:right w:type="dxa" w:w="80"/>
+            </w:tcMar>
+          </w:tcPr>
+          <w:p>
+            <w:pPr>
+              <w:spacing w:line="276"/>
               <w:jc w:val="left"/>
             </w:pPr>
             <w:r>
@@ -2414,22 +2491,23 @@
         </w:tc>
         <w:tc>
           <w:tcPr>
-            <w:tcW w:type="dxa" w:w="1900"/>
-            <w:tcBorders>
-              <w:top w:val="single" w:color="000000" w:sz="1"/>
-              <w:left w:val="single" w:color="000000" w:sz="1"/>
-              <w:bottom w:val="single" w:color="000000" w:sz="1"/>
-              <w:right w:val="single" w:color="000000" w:sz="1"/>
-            </w:tcBorders>
-            <w:tcMar>
-              <w:top w:type="dxa" w:w="40"/>
-              <w:left w:type="dxa" w:w="80"/>
-              <w:bottom w:type="dxa" w:w="40"/>
-              <w:right w:type="dxa" w:w="80"/>
-            </w:tcMar>
-          </w:tcPr>
-          <w:p>
-            <w:pPr>
+            <w:tcW w:type="dxa" w:w="2000"/>
+            <w:tcBorders>
+              <w:top w:val="single" w:color="000000" w:sz="1"/>
+              <w:left w:val="single" w:color="000000" w:sz="1"/>
+              <w:bottom w:val="single" w:color="000000" w:sz="1"/>
+              <w:right w:val="single" w:color="000000" w:sz="1"/>
+            </w:tcBorders>
+            <w:tcMar>
+              <w:top w:type="dxa" w:w="40"/>
+              <w:left w:type="dxa" w:w="80"/>
+              <w:bottom w:type="dxa" w:w="40"/>
+              <w:right w:type="dxa" w:w="80"/>
+            </w:tcMar>
+          </w:tcPr>
+          <w:p>
+            <w:pPr>
+              <w:spacing w:line="276"/>
               <w:jc w:val="center"/>
             </w:pPr>
             <w:r>
@@ -2460,6 +2538,7 @@
           </w:tcPr>
           <w:p>
             <w:pPr>
+              <w:spacing w:line="276"/>
               <w:jc w:val="center"/>
             </w:pPr>
             <w:r>
@@ -2474,27 +2553,30 @@
         </w:tc>
         <w:tc>
           <w:tcPr>
-            <w:tcW w:type="dxa" w:w="2526"/>
-            <w:tcBorders>
-              <w:top w:val="single" w:color="000000" w:sz="1"/>
-              <w:left w:val="single" w:color="000000" w:sz="1"/>
-              <w:bottom w:val="single" w:color="000000" w:sz="1"/>
-              <w:right w:val="single" w:color="000000" w:sz="1"/>
-            </w:tcBorders>
-            <w:tcMar>
-              <w:top w:type="dxa" w:w="40"/>
-              <w:left w:type="dxa" w:w="80"/>
-              <w:bottom w:type="dxa" w:w="40"/>
-              <w:right w:type="dxa" w:w="80"/>
-            </w:tcMar>
-          </w:tcPr>
-          <w:p>
-            <w:pPr>
+            <w:tcW w:type="dxa" w:w="2200"/>
+            <w:tcBorders>
+              <w:top w:val="single" w:color="000000" w:sz="1"/>
+              <w:left w:val="single" w:color="000000" w:sz="1"/>
+              <w:bottom w:val="single" w:color="000000" w:sz="1"/>
+              <w:right w:val="single" w:color="000000" w:sz="1"/>
+            </w:tcBorders>
+            <w:tcMar>
+              <w:top w:type="dxa" w:w="40"/>
+              <w:left w:type="dxa" w:w="80"/>
+              <w:bottom w:type="dxa" w:w="40"/>
+              <w:right w:type="dxa" w:w="80"/>
+            </w:tcMar>
+          </w:tcPr>
+          <w:p>
+            <w:pPr>
+              <w:spacing w:line="276"/>
               <w:jc w:val="center"/>
             </w:pPr>
             <w:r>
               <w:rPr>
                 <w:rFonts w:ascii="Calibri" w:cs="Calibri" w:eastAsia="Calibri" w:hAnsi="Calibri"/>
+                <w:b/>
+                <w:bCs/>
                 <w:sz w:val="20"/>
                 <w:szCs w:val="20"/>
               </w:rPr>
@@ -2506,22 +2588,23 @@
       <w:tr>
         <w:tc>
           <w:tcPr>
-            <w:tcW w:type="dxa" w:w="2400"/>
-            <w:tcBorders>
-              <w:top w:val="single" w:color="000000" w:sz="1"/>
-              <w:left w:val="single" w:color="000000" w:sz="1"/>
-              <w:bottom w:val="single" w:color="000000" w:sz="1"/>
-              <w:right w:val="single" w:color="000000" w:sz="1"/>
-            </w:tcBorders>
-            <w:tcMar>
-              <w:top w:type="dxa" w:w="40"/>
-              <w:left w:type="dxa" w:w="80"/>
-              <w:bottom w:type="dxa" w:w="40"/>
-              <w:right w:type="dxa" w:w="80"/>
-            </w:tcMar>
-          </w:tcPr>
-          <w:p>
-            <w:pPr>
+            <w:tcW w:type="dxa" w:w="2600"/>
+            <w:tcBorders>
+              <w:top w:val="single" w:color="000000" w:sz="1"/>
+              <w:left w:val="single" w:color="000000" w:sz="1"/>
+              <w:bottom w:val="single" w:color="000000" w:sz="1"/>
+              <w:right w:val="single" w:color="000000" w:sz="1"/>
+            </w:tcBorders>
+            <w:tcMar>
+              <w:top w:type="dxa" w:w="40"/>
+              <w:left w:type="dxa" w:w="80"/>
+              <w:bottom w:type="dxa" w:w="40"/>
+              <w:right w:type="dxa" w:w="80"/>
+            </w:tcMar>
+          </w:tcPr>
+          <w:p>
+            <w:pPr>
+              <w:spacing w:line="276"/>
               <w:jc w:val="left"/>
             </w:pPr>
             <w:r>
@@ -2536,22 +2619,23 @@
         </w:tc>
         <w:tc>
           <w:tcPr>
-            <w:tcW w:type="dxa" w:w="1900"/>
-            <w:tcBorders>
-              <w:top w:val="single" w:color="000000" w:sz="1"/>
-              <w:left w:val="single" w:color="000000" w:sz="1"/>
-              <w:bottom w:val="single" w:color="000000" w:sz="1"/>
-              <w:right w:val="single" w:color="000000" w:sz="1"/>
-            </w:tcBorders>
-            <w:tcMar>
-              <w:top w:type="dxa" w:w="40"/>
-              <w:left w:type="dxa" w:w="80"/>
-              <w:bottom w:type="dxa" w:w="40"/>
-              <w:right w:type="dxa" w:w="80"/>
-            </w:tcMar>
-          </w:tcPr>
-          <w:p>
-            <w:pPr>
+            <w:tcW w:type="dxa" w:w="2000"/>
+            <w:tcBorders>
+              <w:top w:val="single" w:color="000000" w:sz="1"/>
+              <w:left w:val="single" w:color="000000" w:sz="1"/>
+              <w:bottom w:val="single" w:color="000000" w:sz="1"/>
+              <w:right w:val="single" w:color="000000" w:sz="1"/>
+            </w:tcBorders>
+            <w:tcMar>
+              <w:top w:type="dxa" w:w="40"/>
+              <w:left w:type="dxa" w:w="80"/>
+              <w:bottom w:type="dxa" w:w="40"/>
+              <w:right w:type="dxa" w:w="80"/>
+            </w:tcMar>
+          </w:tcPr>
+          <w:p>
+            <w:pPr>
+              <w:spacing w:line="276"/>
               <w:jc w:val="center"/>
             </w:pPr>
             <w:r>
@@ -2582,6 +2666,7 @@
           </w:tcPr>
           <w:p>
             <w:pPr>
+              <w:spacing w:line="276"/>
               <w:jc w:val="center"/>
             </w:pPr>
             <w:r>
@@ -2596,22 +2681,23 @@
         </w:tc>
         <w:tc>
           <w:tcPr>
-            <w:tcW w:type="dxa" w:w="2526"/>
-            <w:tcBorders>
-              <w:top w:val="single" w:color="000000" w:sz="1"/>
-              <w:left w:val="single" w:color="000000" w:sz="1"/>
-              <w:bottom w:val="single" w:color="000000" w:sz="1"/>
-              <w:right w:val="single" w:color="000000" w:sz="1"/>
-            </w:tcBorders>
-            <w:tcMar>
-              <w:top w:type="dxa" w:w="40"/>
-              <w:left w:type="dxa" w:w="80"/>
-              <w:bottom w:type="dxa" w:w="40"/>
-              <w:right w:type="dxa" w:w="80"/>
-            </w:tcMar>
-          </w:tcPr>
-          <w:p>
-            <w:pPr>
+            <w:tcW w:type="dxa" w:w="2200"/>
+            <w:tcBorders>
+              <w:top w:val="single" w:color="000000" w:sz="1"/>
+              <w:left w:val="single" w:color="000000" w:sz="1"/>
+              <w:bottom w:val="single" w:color="000000" w:sz="1"/>
+              <w:right w:val="single" w:color="000000" w:sz="1"/>
+            </w:tcBorders>
+            <w:tcMar>
+              <w:top w:type="dxa" w:w="40"/>
+              <w:left w:type="dxa" w:w="80"/>
+              <w:bottom w:type="dxa" w:w="40"/>
+              <w:right w:type="dxa" w:w="80"/>
+            </w:tcMar>
+          </w:tcPr>
+          <w:p>
+            <w:pPr>
+              <w:spacing w:line="276"/>
               <w:jc w:val="center"/>
             </w:pPr>
             <w:r>
@@ -2628,108 +2714,117 @@
     </w:tbl>
     <w:p>
       <w:pPr>
-        <w:spacing w:after="60"/>
-      </w:pPr>
-    </w:p>
-    <w:p>
-      <w:pPr>
-        <w:spacing w:after="120" w:line="276"/>
-        <w:jc w:val="both"/>
-      </w:pPr>
-      <w:r>
-        <w:rPr>
-          <w:rFonts w:ascii="Calibri" w:cs="Calibri" w:eastAsia="Calibri" w:hAnsi="Calibri"/>
-          <w:b/>
-          <w:bCs/>
-          <w:sz w:val="20"/>
-          <w:szCs w:val="20"/>
-        </w:rPr>
-        <w:t xml:space="preserve">Finding 1: LLM graders are substantially more robust to surface-level variation. </w:t>
-      </w:r>
-      <w:r>
-        <w:rPr>
-          <w:rFonts w:ascii="Calibri" w:cs="Calibri" w:eastAsia="Calibri" w:hAnsi="Calibri"/>
-          <w:sz w:val="20"/>
-          <w:szCs w:val="20"/>
-        </w:rPr>
-        <w:t xml:space="preserve">GPT-5.4 mini Level 0 achieves IVR_flip of 0.243 versus 0.337 for the HybridGrader under Protocol A — a 28% relative reduction in invariance violations. With the reference answer available (Level 1), invariance violations fall further to 0.134, a 45% relative reduction over Level 0 and a 60% reduction over the HybridGrader baseline. The reference answer acts as a semantic anchor: surface variations that did not change meaning are recognised as such because the model has an explicit target to compare against.</w:t>
-      </w:r>
-    </w:p>
-    <w:p>
-      <w:pPr>
-        <w:spacing w:after="120" w:line="276"/>
-        <w:jc w:val="both"/>
-      </w:pPr>
-      <w:r>
-        <w:rPr>
-          <w:rFonts w:ascii="Calibri" w:cs="Calibri" w:eastAsia="Calibri" w:hAnsi="Calibri"/>
-          <w:b/>
-          <w:bCs/>
-          <w:sz w:val="20"/>
-          <w:szCs w:val="20"/>
-        </w:rPr>
-        <w:t xml:space="preserve">Finding 2: LLM graders detect meaning-altering perturbations far more effectively. </w:t>
-      </w:r>
-      <w:r>
-        <w:rPr>
-          <w:rFonts w:ascii="Calibri" w:cs="Calibri" w:eastAsia="Calibri" w:hAnsi="Calibri"/>
-          <w:sz w:val="20"/>
-          <w:szCs w:val="20"/>
-        </w:rPr>
-        <w:t xml:space="preserve">SSR_directional of 0.420 (Level 0) and 0.461 (Level 1) versus 0.140 for the HybridGrader represents an approximately threefold improvement. The HybridGrader misses 86% of negation insertions, concept deletions, and semantic contradictions; the LLM at Level 1 misses 54%. While neither achieves ceiling performance, the gap demonstrates that language understanding — rather than pattern matching on surface features — enables substantially better sensitivity detection.</w:t>
-      </w:r>
-    </w:p>
-    <w:p>
-      <w:pPr>
-        <w:spacing w:after="120" w:line="276"/>
-        <w:jc w:val="both"/>
-      </w:pPr>
-      <w:r>
-        <w:rPr>
-          <w:rFonts w:ascii="Calibri" w:cs="Calibri" w:eastAsia="Calibri" w:hAnsi="Calibri"/>
-          <w:b/>
-          <w:bCs/>
-          <w:sz w:val="20"/>
-          <w:szCs w:val="20"/>
-        </w:rPr>
-        <w:t xml:space="preserve">Finding 3: Reference-answer availability introduces a non-obvious gaming trade-off. </w:t>
-      </w:r>
-      <w:r>
-        <w:rPr>
-          <w:rFonts w:ascii="Calibri" w:cs="Calibri" w:eastAsia="Calibri" w:hAnsi="Calibri"/>
-          <w:sz w:val="20"/>
-          <w:szCs w:val="20"/>
-        </w:rPr>
-        <w:t xml:space="preserve">The most surprising result is that providing the reference answer (Level 1) almost doubles gaming susceptibility relative to Level 0 (ASR 0.118 vs 0.067). This is a 76% relative increase in vulnerability to adversarial manipulation. The mechanism is intuitive in retrospect: the prompt instructs the model to compare the student answer against the reference. When the gaming perturbation injects keywords drawn from the reference answer into a wrong response, the model finds those keywords during the comparison and treats them as evidence of partial understanding. The reference answer thus inadvertently functions as a checklist that an adversarial student can copy from.</w:t>
-      </w:r>
-    </w:p>
-    <w:p>
-      <w:pPr>
-        <w:spacing w:after="120" w:line="276"/>
-        <w:jc w:val="both"/>
-      </w:pPr>
-      <w:r>
-        <w:rPr>
-          <w:rFonts w:ascii="Calibri" w:cs="Calibri" w:eastAsia="Calibri" w:hAnsi="Calibri"/>
-          <w:b/>
-          <w:bCs/>
-          <w:sz w:val="20"/>
-          <w:szCs w:val="20"/>
-        </w:rPr>
-        <w:t xml:space="preserve">Finding 4: Multi-metric evaluation reveals trade-offs invisible to any single metric. </w:t>
-      </w:r>
-      <w:r>
-        <w:rPr>
-          <w:rFonts w:ascii="Calibri" w:cs="Calibri" w:eastAsia="Calibri" w:hAnsi="Calibri"/>
-          <w:sz w:val="20"/>
-          <w:szCs w:val="20"/>
-        </w:rPr>
-        <w:t xml:space="preserve">Looking at any one metric in isolation produces a misleading picture. On invariance alone, Level 1 looks unambiguously better than Level 0. On sensitivity alone, both look comparable. On gaming alone, Level 0 is dramatically better. The full picture only emerges when all three dimensions are considered jointly: adding reference-answer information improves two validity dimensions while degrading a third.</w:t>
-      </w:r>
-    </w:p>
-    <w:p>
-      <w:pPr>
-        <w:spacing w:after="100" w:before="200"/>
+        <w:spacing w:after="120" w:line="276"/>
+        <w:jc w:val="both"/>
+      </w:pPr>
+      <w:r>
+        <w:rPr>
+          <w:rFonts w:ascii="Calibri" w:cs="Calibri" w:eastAsia="Calibri" w:hAnsi="Calibri"/>
+          <w:b/>
+          <w:bCs/>
+          <w:sz w:val="20"/>
+          <w:szCs w:val="20"/>
+        </w:rPr>
+        <w:t xml:space="preserve">Finding 1: LLM graders are substantially more robust to surface-level variation.</w:t>
+      </w:r>
+      <w:r>
+        <w:rPr>
+          <w:rFonts w:ascii="Calibri" w:cs="Calibri" w:eastAsia="Calibri" w:hAnsi="Calibri"/>
+          <w:sz w:val="20"/>
+          <w:szCs w:val="20"/>
+        </w:rPr>
+        <w:t xml:space="preserve"> GPT-5.4 mini Level 0 achieves IVR_flip of 0.243 versus 0.337 for the HybridGrader under Protocol A — a 28% relative reduction in invariance violations. With the reference answer available (Level 1), invariance violations fall further to 0.134, a 45% relative reduction over Level 0 and a 60% reduction over the HybridGrader baseline. The reference answer acts as a semantic anchor: surface variations that did not change meaning are recognised as such because the model has an explicit target to compare against.</w:t>
+      </w:r>
+    </w:p>
+    <w:p>
+      <w:pPr>
+        <w:spacing w:after="120" w:line="276"/>
+        <w:jc w:val="both"/>
+      </w:pPr>
+      <w:r>
+        <w:rPr>
+          <w:rFonts w:ascii="Calibri" w:cs="Calibri" w:eastAsia="Calibri" w:hAnsi="Calibri"/>
+          <w:b/>
+          <w:bCs/>
+          <w:sz w:val="20"/>
+          <w:szCs w:val="20"/>
+        </w:rPr>
+        <w:t xml:space="preserve">Finding 2: LLM graders detect meaning-altering perturbations far more effectively.</w:t>
+      </w:r>
+      <w:r>
+        <w:rPr>
+          <w:rFonts w:ascii="Calibri" w:cs="Calibri" w:eastAsia="Calibri" w:hAnsi="Calibri"/>
+          <w:sz w:val="20"/>
+          <w:szCs w:val="20"/>
+        </w:rPr>
+        <w:t xml:space="preserve"> SSR_directional of 0.420 (Level 0) and 0.461 (Level 1) versus 0.140 for the HybridGrader represents an approximately threefold improvement. The HybridGrader misses 86% of negation insertions, concept deletions, and semantic contradictions; the LLM at Level 1 misses 54%. While neither achieves ceiling performance, the gap demonstrates that language understanding — rather than pattern matching on surface features — enables substantially better sensitivity detection. Adding the reference answer provides only a modest additional gain (+4 percentage points), suggesting that most of the LLM’s sensitivity advantage stems from semantic processing rather than from access to a comparison target.</w:t>
+      </w:r>
+    </w:p>
+    <w:p>
+      <w:pPr>
+        <w:spacing w:after="120" w:line="276"/>
+        <w:jc w:val="both"/>
+      </w:pPr>
+      <w:r>
+        <w:rPr>
+          <w:rFonts w:ascii="Calibri" w:cs="Calibri" w:eastAsia="Calibri" w:hAnsi="Calibri"/>
+          <w:b/>
+          <w:bCs/>
+          <w:sz w:val="20"/>
+          <w:szCs w:val="20"/>
+        </w:rPr>
+        <w:t xml:space="preserve">Finding 3: Reference-answer availability introduces a non-obvious gaming trade-off.</w:t>
+      </w:r>
+      <w:r>
+        <w:rPr>
+          <w:rFonts w:ascii="Calibri" w:cs="Calibri" w:eastAsia="Calibri" w:hAnsi="Calibri"/>
+          <w:sz w:val="20"/>
+          <w:szCs w:val="20"/>
+        </w:rPr>
+        <w:t xml:space="preserve"> The most surprising result is that providing the reference answer (Level 1) almost doubles gaming susceptibility relative to Level 0 (ASR 0.118 vs 0.067). This is a 76% relative increase in vulnerability to adversarial manipulation. The mechanism is intuitive in retrospect: the prompt instructs the model to compare the student answer against the reference. When the gaming perturbation injects keywords drawn from the reference answer into a wrong response, the model finds those keywords during the comparison and treats them as evidence of partial understanding. The reference answer thus inadvertently functions as a checklist that an adversarial student can copy from. Level 0, lacking this anchor, must judge the answer on its overall coherence and is correspondingly harder to game with surface-level keyword injection.</w:t>
+      </w:r>
+    </w:p>
+    <w:p>
+      <w:pPr>
+        <w:spacing w:after="120" w:line="276"/>
+        <w:jc w:val="both"/>
+      </w:pPr>
+      <w:r>
+        <w:rPr>
+          <w:rFonts w:ascii="Calibri" w:cs="Calibri" w:eastAsia="Calibri" w:hAnsi="Calibri"/>
+          <w:b/>
+          <w:bCs/>
+          <w:sz w:val="20"/>
+          <w:szCs w:val="20"/>
+        </w:rPr>
+        <w:t xml:space="preserve">Finding 4: Multi-metric evaluation reveals trade-offs invisible to any single metric.</w:t>
+      </w:r>
+      <w:r>
+        <w:rPr>
+          <w:rFonts w:ascii="Calibri" w:cs="Calibri" w:eastAsia="Calibri" w:hAnsi="Calibri"/>
+          <w:sz w:val="20"/>
+          <w:szCs w:val="20"/>
+        </w:rPr>
+        <w:t xml:space="preserve"> Looking at any one metric in isolation produces a misleading picture. On invariance alone, Level 1 looks unambiguously better than Level 0. On sensitivity alone, both look comparable. On gaming alone, Level 0 is dramatically better. The full picture only emerges when all three dimensions are considered jointly: adding reference-answer information improves two validity dimensions while degrading a third. A practitioner choosing between L0 and L1 on the basis of accuracy or invariance alone would have no way of seeing the gaming cost they are incurring.</w:t>
+      </w:r>
+    </w:p>
+    <w:p>
+      <w:pPr>
+        <w:spacing w:after="120" w:line="276"/>
+        <w:jc w:val="both"/>
+      </w:pPr>
+      <w:r>
+        <w:rPr>
+          <w:rFonts w:ascii="Calibri" w:cs="Calibri" w:eastAsia="Calibri" w:hAnsi="Calibri"/>
+          <w:sz w:val="20"/>
+          <w:szCs w:val="20"/>
+        </w:rPr>
+        <w:t xml:space="preserve">The same point applies to the trained baseline. If robustness were assessed using invariance metrics alone, the HybridGrader would appear reasonably robust under Protocol B (IVR_flip = 0.179). However, SSR_directional = 0.120 reveals that this apparent stability partly reflects indiscrimination: the grader assigns similar scores to original and perturbed answers not because it is robust, but because it is insensitive to meaning changes. The combination of low IVR and low SSR signals a grader that rarely changes its mind — even when it should. This pattern is only visible through multi-metric evaluation grounded in distinct validity threats.</w:t>
+      </w:r>
+    </w:p>
+    <w:p>
+      <w:pPr>
+        <w:spacing w:after="100" w:before="200" w:line="276"/>
       </w:pPr>
       <w:r>
         <w:rPr>
@@ -2758,7 +2853,664 @@
     </w:p>
     <w:p>
       <w:pPr>
-        <w:spacing w:after="120" w:before="240"/>
+        <w:spacing w:after="120" w:line="276"/>
+        <w:jc w:val="both"/>
+      </w:pPr>
+      <w:r>
+        <w:rPr>
+          <w:rFonts w:ascii="Calibri" w:cs="Calibri" w:eastAsia="Calibri" w:hAnsi="Calibri"/>
+          <w:sz w:val="20"/>
+          <w:szCs w:val="20"/>
+        </w:rPr>
+        <w:t xml:space="preserve">A symmetric artefact affects SSR_directional: answers already scored 0.0 cannot decrease further under sensitivity perturbations, mechanically producing SSR = 0% on those pairs regardless of grader quality. We term this the floor effect. Table 3 reports SSR with and without floor-affected pairs.</w:t>
+      </w:r>
+    </w:p>
+    <w:p>
+      <w:pPr>
+        <w:spacing w:after="100" w:before="200" w:line="276"/>
+        <w:jc w:val="center"/>
+      </w:pPr>
+      <w:r>
+        <w:rPr>
+          <w:rFonts w:ascii="Calibri" w:cs="Calibri" w:eastAsia="Calibri" w:hAnsi="Calibri"/>
+          <w:b/>
+          <w:bCs/>
+          <w:i/>
+          <w:iCs/>
+          <w:sz w:val="20"/>
+          <w:szCs w:val="20"/>
+        </w:rPr>
+        <w:t xml:space="preserve">Table 3. SSR floor-effect analysis: overall vs. restricted to answers with original score &gt; 0.</w:t>
+      </w:r>
+    </w:p>
+    <w:tbl>
+      <w:tblPr>
+        <w:tblW w:type="dxa" w:w="9000"/>
+        <w:tblBorders>
+          <w:top w:val="single" w:color="auto" w:sz="4"/>
+          <w:left w:val="single" w:color="auto" w:sz="4"/>
+          <w:bottom w:val="single" w:color="auto" w:sz="4"/>
+          <w:right w:val="single" w:color="auto" w:sz="4"/>
+          <w:insideH w:val="single" w:color="auto" w:sz="4"/>
+          <w:insideV w:val="single" w:color="auto" w:sz="4"/>
+        </w:tblBorders>
+        <w:tblLayout w:type="fixed"/>
+      </w:tblPr>
+      <w:tblGrid>
+        <w:gridCol w:w="1800"/>
+        <w:gridCol w:w="1100"/>
+        <w:gridCol w:w="1700"/>
+        <w:gridCol w:w="1400"/>
+        <w:gridCol w:w="1700"/>
+        <w:gridCol w:w="1300"/>
+      </w:tblGrid>
+      <w:tr>
+        <w:trPr>
+          <w:tblHeader/>
+        </w:trPr>
+        <w:tc>
+          <w:tcPr>
+            <w:tcW w:type="dxa" w:w="1800"/>
+            <w:tcBorders>
+              <w:top w:val="single" w:color="000000" w:sz="1"/>
+              <w:left w:val="single" w:color="000000" w:sz="1"/>
+              <w:bottom w:val="single" w:color="000000" w:sz="1"/>
+              <w:right w:val="single" w:color="000000" w:sz="1"/>
+            </w:tcBorders>
+            <w:shd w:fill="D9E2F3" w:color="auto" w:val="clear"/>
+            <w:tcMar>
+              <w:top w:type="dxa" w:w="40"/>
+              <w:left w:type="dxa" w:w="80"/>
+              <w:bottom w:type="dxa" w:w="40"/>
+              <w:right w:type="dxa" w:w="80"/>
+            </w:tcMar>
+          </w:tcPr>
+          <w:p>
+            <w:pPr>
+              <w:spacing w:line="276"/>
+              <w:jc w:val="center"/>
+            </w:pPr>
+            <w:r>
+              <w:rPr>
+                <w:rFonts w:ascii="Calibri" w:cs="Calibri" w:eastAsia="Calibri" w:hAnsi="Calibri"/>
+                <w:b/>
+                <w:bCs/>
+                <w:sz w:val="20"/>
+                <w:szCs w:val="20"/>
+              </w:rPr>
+              <w:t xml:space="preserve">Configuration</w:t>
+            </w:r>
+          </w:p>
+        </w:tc>
+        <w:tc>
+          <w:tcPr>
+            <w:tcW w:type="dxa" w:w="1100"/>
+            <w:tcBorders>
+              <w:top w:val="single" w:color="000000" w:sz="1"/>
+              <w:left w:val="single" w:color="000000" w:sz="1"/>
+              <w:bottom w:val="single" w:color="000000" w:sz="1"/>
+              <w:right w:val="single" w:color="000000" w:sz="1"/>
+            </w:tcBorders>
+            <w:shd w:fill="D9E2F3" w:color="auto" w:val="clear"/>
+            <w:tcMar>
+              <w:top w:type="dxa" w:w="40"/>
+              <w:left w:type="dxa" w:w="80"/>
+              <w:bottom w:type="dxa" w:w="40"/>
+              <w:right w:type="dxa" w:w="80"/>
+            </w:tcMar>
+          </w:tcPr>
+          <w:p>
+            <w:pPr>
+              <w:spacing w:line="276"/>
+              <w:jc w:val="center"/>
+            </w:pPr>
+            <w:r>
+              <w:rPr>
+                <w:rFonts w:ascii="Calibri" w:cs="Calibri" w:eastAsia="Calibri" w:hAnsi="Calibri"/>
+                <w:b/>
+                <w:bCs/>
+                <w:sz w:val="20"/>
+                <w:szCs w:val="20"/>
+              </w:rPr>
+              <w:t xml:space="preserve">Pairs</w:t>
+            </w:r>
+          </w:p>
+        </w:tc>
+        <w:tc>
+          <w:tcPr>
+            <w:tcW w:type="dxa" w:w="1700"/>
+            <w:tcBorders>
+              <w:top w:val="single" w:color="000000" w:sz="1"/>
+              <w:left w:val="single" w:color="000000" w:sz="1"/>
+              <w:bottom w:val="single" w:color="000000" w:sz="1"/>
+              <w:right w:val="single" w:color="000000" w:sz="1"/>
+            </w:tcBorders>
+            <w:shd w:fill="D9E2F3" w:color="auto" w:val="clear"/>
+            <w:tcMar>
+              <w:top w:type="dxa" w:w="40"/>
+              <w:left w:type="dxa" w:w="80"/>
+              <w:bottom w:type="dxa" w:w="40"/>
+              <w:right w:type="dxa" w:w="80"/>
+            </w:tcMar>
+          </w:tcPr>
+          <w:p>
+            <w:pPr>
+              <w:spacing w:line="276"/>
+              <w:jc w:val="center"/>
+            </w:pPr>
+            <w:r>
+              <w:rPr>
+                <w:rFonts w:ascii="Calibri" w:cs="Calibri" w:eastAsia="Calibri" w:hAnsi="Calibri"/>
+                <w:b/>
+                <w:bCs/>
+                <w:sz w:val="20"/>
+                <w:szCs w:val="20"/>
+              </w:rPr>
+              <w:t xml:space="preserve">Floor pairs (orig=0)</w:t>
+            </w:r>
+          </w:p>
+        </w:tc>
+        <w:tc>
+          <w:tcPr>
+            <w:tcW w:type="dxa" w:w="1400"/>
+            <w:tcBorders>
+              <w:top w:val="single" w:color="000000" w:sz="1"/>
+              <w:left w:val="single" w:color="000000" w:sz="1"/>
+              <w:bottom w:val="single" w:color="000000" w:sz="1"/>
+              <w:right w:val="single" w:color="000000" w:sz="1"/>
+            </w:tcBorders>
+            <w:shd w:fill="D9E2F3" w:color="auto" w:val="clear"/>
+            <w:tcMar>
+              <w:top w:type="dxa" w:w="40"/>
+              <w:left w:type="dxa" w:w="80"/>
+              <w:bottom w:type="dxa" w:w="40"/>
+              <w:right w:type="dxa" w:w="80"/>
+            </w:tcMar>
+          </w:tcPr>
+          <w:p>
+            <w:pPr>
+              <w:spacing w:line="276"/>
+              <w:jc w:val="center"/>
+            </w:pPr>
+            <w:r>
+              <w:rPr>
+                <w:rFonts w:ascii="Calibri" w:cs="Calibri" w:eastAsia="Calibri" w:hAnsi="Calibri"/>
+                <w:b/>
+                <w:bCs/>
+                <w:sz w:val="20"/>
+                <w:szCs w:val="20"/>
+              </w:rPr>
+              <w:t xml:space="preserve">SSR overall</w:t>
+            </w:r>
+          </w:p>
+        </w:tc>
+        <w:tc>
+          <w:tcPr>
+            <w:tcW w:type="dxa" w:w="1700"/>
+            <w:tcBorders>
+              <w:top w:val="single" w:color="000000" w:sz="1"/>
+              <w:left w:val="single" w:color="000000" w:sz="1"/>
+              <w:bottom w:val="single" w:color="000000" w:sz="1"/>
+              <w:right w:val="single" w:color="000000" w:sz="1"/>
+            </w:tcBorders>
+            <w:shd w:fill="D9E2F3" w:color="auto" w:val="clear"/>
+            <w:tcMar>
+              <w:top w:type="dxa" w:w="40"/>
+              <w:left w:type="dxa" w:w="80"/>
+              <w:bottom w:type="dxa" w:w="40"/>
+              <w:right w:type="dxa" w:w="80"/>
+            </w:tcMar>
+          </w:tcPr>
+          <w:p>
+            <w:pPr>
+              <w:spacing w:line="276"/>
+              <w:jc w:val="center"/>
+            </w:pPr>
+            <w:r>
+              <w:rPr>
+                <w:rFonts w:ascii="Calibri" w:cs="Calibri" w:eastAsia="Calibri" w:hAnsi="Calibri"/>
+                <w:b/>
+                <w:bCs/>
+                <w:sz w:val="20"/>
+                <w:szCs w:val="20"/>
+              </w:rPr>
+              <w:t xml:space="preserve">SSR non-floor (orig&gt;0)</w:t>
+            </w:r>
+          </w:p>
+        </w:tc>
+        <w:tc>
+          <w:tcPr>
+            <w:tcW w:type="dxa" w:w="1300"/>
+            <w:tcBorders>
+              <w:top w:val="single" w:color="000000" w:sz="1"/>
+              <w:left w:val="single" w:color="000000" w:sz="1"/>
+              <w:bottom w:val="single" w:color="000000" w:sz="1"/>
+              <w:right w:val="single" w:color="000000" w:sz="1"/>
+            </w:tcBorders>
+            <w:shd w:fill="D9E2F3" w:color="auto" w:val="clear"/>
+            <w:tcMar>
+              <w:top w:type="dxa" w:w="40"/>
+              <w:left w:type="dxa" w:w="80"/>
+              <w:bottom w:type="dxa" w:w="40"/>
+              <w:right w:type="dxa" w:w="80"/>
+            </w:tcMar>
+          </w:tcPr>
+          <w:p>
+            <w:pPr>
+              <w:spacing w:line="276"/>
+              <w:jc w:val="center"/>
+            </w:pPr>
+            <w:r>
+              <w:rPr>
+                <w:rFonts w:ascii="Calibri" w:cs="Calibri" w:eastAsia="Calibri" w:hAnsi="Calibri"/>
+                <w:b/>
+                <w:bCs/>
+                <w:sz w:val="20"/>
+                <w:szCs w:val="20"/>
+              </w:rPr>
+              <w:t xml:space="preserve">Delta</w:t>
+            </w:r>
+          </w:p>
+        </w:tc>
+      </w:tr>
+      <w:tr>
+        <w:tc>
+          <w:tcPr>
+            <w:tcW w:type="dxa" w:w="1800"/>
+            <w:tcBorders>
+              <w:top w:val="single" w:color="000000" w:sz="1"/>
+              <w:left w:val="single" w:color="000000" w:sz="1"/>
+              <w:bottom w:val="single" w:color="000000" w:sz="1"/>
+              <w:right w:val="single" w:color="000000" w:sz="1"/>
+            </w:tcBorders>
+            <w:tcMar>
+              <w:top w:type="dxa" w:w="40"/>
+              <w:left w:type="dxa" w:w="80"/>
+              <w:bottom w:type="dxa" w:w="40"/>
+              <w:right w:type="dxa" w:w="80"/>
+            </w:tcMar>
+          </w:tcPr>
+          <w:p>
+            <w:pPr>
+              <w:spacing w:line="276"/>
+              <w:jc w:val="left"/>
+            </w:pPr>
+            <w:r>
+              <w:rPr>
+                <w:rFonts w:ascii="Calibri" w:cs="Calibri" w:eastAsia="Calibri" w:hAnsi="Calibri"/>
+                <w:sz w:val="20"/>
+                <w:szCs w:val="20"/>
+              </w:rPr>
+              <w:t xml:space="preserve">GPT-5.4 mini L0</w:t>
+            </w:r>
+          </w:p>
+        </w:tc>
+        <w:tc>
+          <w:tcPr>
+            <w:tcW w:type="dxa" w:w="1100"/>
+            <w:tcBorders>
+              <w:top w:val="single" w:color="000000" w:sz="1"/>
+              <w:left w:val="single" w:color="000000" w:sz="1"/>
+              <w:bottom w:val="single" w:color="000000" w:sz="1"/>
+              <w:right w:val="single" w:color="000000" w:sz="1"/>
+            </w:tcBorders>
+            <w:tcMar>
+              <w:top w:type="dxa" w:w="40"/>
+              <w:left w:type="dxa" w:w="80"/>
+              <w:bottom w:type="dxa" w:w="40"/>
+              <w:right w:type="dxa" w:w="80"/>
+            </w:tcMar>
+          </w:tcPr>
+          <w:p>
+            <w:pPr>
+              <w:spacing w:line="276"/>
+              <w:jc w:val="center"/>
+            </w:pPr>
+            <w:r>
+              <w:rPr>
+                <w:rFonts w:ascii="Calibri" w:cs="Calibri" w:eastAsia="Calibri" w:hAnsi="Calibri"/>
+                <w:sz w:val="20"/>
+                <w:szCs w:val="20"/>
+              </w:rPr>
+              <w:t xml:space="preserve">13,155</w:t>
+            </w:r>
+          </w:p>
+        </w:tc>
+        <w:tc>
+          <w:tcPr>
+            <w:tcW w:type="dxa" w:w="1700"/>
+            <w:tcBorders>
+              <w:top w:val="single" w:color="000000" w:sz="1"/>
+              <w:left w:val="single" w:color="000000" w:sz="1"/>
+              <w:bottom w:val="single" w:color="000000" w:sz="1"/>
+              <w:right w:val="single" w:color="000000" w:sz="1"/>
+            </w:tcBorders>
+            <w:tcMar>
+              <w:top w:type="dxa" w:w="40"/>
+              <w:left w:type="dxa" w:w="80"/>
+              <w:bottom w:type="dxa" w:w="40"/>
+              <w:right w:type="dxa" w:w="80"/>
+            </w:tcMar>
+          </w:tcPr>
+          <w:p>
+            <w:pPr>
+              <w:spacing w:line="276"/>
+              <w:jc w:val="center"/>
+            </w:pPr>
+            <w:r>
+              <w:rPr>
+                <w:rFonts w:ascii="Calibri" w:cs="Calibri" w:eastAsia="Calibri" w:hAnsi="Calibri"/>
+                <w:sz w:val="20"/>
+                <w:szCs w:val="20"/>
+              </w:rPr>
+              <w:t xml:space="preserve">3,012 (22.9%)</w:t>
+            </w:r>
+          </w:p>
+        </w:tc>
+        <w:tc>
+          <w:tcPr>
+            <w:tcW w:type="dxa" w:w="1400"/>
+            <w:tcBorders>
+              <w:top w:val="single" w:color="000000" w:sz="1"/>
+              <w:left w:val="single" w:color="000000" w:sz="1"/>
+              <w:bottom w:val="single" w:color="000000" w:sz="1"/>
+              <w:right w:val="single" w:color="000000" w:sz="1"/>
+            </w:tcBorders>
+            <w:tcMar>
+              <w:top w:type="dxa" w:w="40"/>
+              <w:left w:type="dxa" w:w="80"/>
+              <w:bottom w:type="dxa" w:w="40"/>
+              <w:right w:type="dxa" w:w="80"/>
+            </w:tcMar>
+          </w:tcPr>
+          <w:p>
+            <w:pPr>
+              <w:spacing w:line="276"/>
+              <w:jc w:val="center"/>
+            </w:pPr>
+            <w:r>
+              <w:rPr>
+                <w:rFonts w:ascii="Calibri" w:cs="Calibri" w:eastAsia="Calibri" w:hAnsi="Calibri"/>
+                <w:sz w:val="20"/>
+                <w:szCs w:val="20"/>
+              </w:rPr>
+              <w:t xml:space="preserve">0.423</w:t>
+            </w:r>
+          </w:p>
+        </w:tc>
+        <w:tc>
+          <w:tcPr>
+            <w:tcW w:type="dxa" w:w="1700"/>
+            <w:tcBorders>
+              <w:top w:val="single" w:color="000000" w:sz="1"/>
+              <w:left w:val="single" w:color="000000" w:sz="1"/>
+              <w:bottom w:val="single" w:color="000000" w:sz="1"/>
+              <w:right w:val="single" w:color="000000" w:sz="1"/>
+            </w:tcBorders>
+            <w:tcMar>
+              <w:top w:type="dxa" w:w="40"/>
+              <w:left w:type="dxa" w:w="80"/>
+              <w:bottom w:type="dxa" w:w="40"/>
+              <w:right w:type="dxa" w:w="80"/>
+            </w:tcMar>
+          </w:tcPr>
+          <w:p>
+            <w:pPr>
+              <w:spacing w:line="276"/>
+              <w:jc w:val="center"/>
+            </w:pPr>
+            <w:r>
+              <w:rPr>
+                <w:rFonts w:ascii="Calibri" w:cs="Calibri" w:eastAsia="Calibri" w:hAnsi="Calibri"/>
+                <w:b/>
+                <w:bCs/>
+                <w:sz w:val="20"/>
+                <w:szCs w:val="20"/>
+              </w:rPr>
+              <w:t xml:space="preserve">0.549</w:t>
+            </w:r>
+          </w:p>
+        </w:tc>
+        <w:tc>
+          <w:tcPr>
+            <w:tcW w:type="dxa" w:w="1300"/>
+            <w:tcBorders>
+              <w:top w:val="single" w:color="000000" w:sz="1"/>
+              <w:left w:val="single" w:color="000000" w:sz="1"/>
+              <w:bottom w:val="single" w:color="000000" w:sz="1"/>
+              <w:right w:val="single" w:color="000000" w:sz="1"/>
+            </w:tcBorders>
+            <w:tcMar>
+              <w:top w:type="dxa" w:w="40"/>
+              <w:left w:type="dxa" w:w="80"/>
+              <w:bottom w:type="dxa" w:w="40"/>
+              <w:right w:type="dxa" w:w="80"/>
+            </w:tcMar>
+          </w:tcPr>
+          <w:p>
+            <w:pPr>
+              <w:spacing w:line="276"/>
+              <w:jc w:val="center"/>
+            </w:pPr>
+            <w:r>
+              <w:rPr>
+                <w:rFonts w:ascii="Calibri" w:cs="Calibri" w:eastAsia="Calibri" w:hAnsi="Calibri"/>
+                <w:sz w:val="20"/>
+                <w:szCs w:val="20"/>
+              </w:rPr>
+              <w:t xml:space="preserve">+12.6 pp</w:t>
+            </w:r>
+          </w:p>
+        </w:tc>
+      </w:tr>
+      <w:tr>
+        <w:tc>
+          <w:tcPr>
+            <w:tcW w:type="dxa" w:w="1800"/>
+            <w:tcBorders>
+              <w:top w:val="single" w:color="000000" w:sz="1"/>
+              <w:left w:val="single" w:color="000000" w:sz="1"/>
+              <w:bottom w:val="single" w:color="000000" w:sz="1"/>
+              <w:right w:val="single" w:color="000000" w:sz="1"/>
+            </w:tcBorders>
+            <w:tcMar>
+              <w:top w:type="dxa" w:w="40"/>
+              <w:left w:type="dxa" w:w="80"/>
+              <w:bottom w:type="dxa" w:w="40"/>
+              <w:right w:type="dxa" w:w="80"/>
+            </w:tcMar>
+          </w:tcPr>
+          <w:p>
+            <w:pPr>
+              <w:spacing w:line="276"/>
+              <w:jc w:val="left"/>
+            </w:pPr>
+            <w:r>
+              <w:rPr>
+                <w:rFonts w:ascii="Calibri" w:cs="Calibri" w:eastAsia="Calibri" w:hAnsi="Calibri"/>
+                <w:sz w:val="20"/>
+                <w:szCs w:val="20"/>
+              </w:rPr>
+              <w:t xml:space="preserve">GPT-5.4 mini L1</w:t>
+            </w:r>
+          </w:p>
+        </w:tc>
+        <w:tc>
+          <w:tcPr>
+            <w:tcW w:type="dxa" w:w="1100"/>
+            <w:tcBorders>
+              <w:top w:val="single" w:color="000000" w:sz="1"/>
+              <w:left w:val="single" w:color="000000" w:sz="1"/>
+              <w:bottom w:val="single" w:color="000000" w:sz="1"/>
+              <w:right w:val="single" w:color="000000" w:sz="1"/>
+            </w:tcBorders>
+            <w:tcMar>
+              <w:top w:type="dxa" w:w="40"/>
+              <w:left w:type="dxa" w:w="80"/>
+              <w:bottom w:type="dxa" w:w="40"/>
+              <w:right w:type="dxa" w:w="80"/>
+            </w:tcMar>
+          </w:tcPr>
+          <w:p>
+            <w:pPr>
+              <w:spacing w:line="276"/>
+              <w:jc w:val="center"/>
+            </w:pPr>
+            <w:r>
+              <w:rPr>
+                <w:rFonts w:ascii="Calibri" w:cs="Calibri" w:eastAsia="Calibri" w:hAnsi="Calibri"/>
+                <w:sz w:val="20"/>
+                <w:szCs w:val="20"/>
+              </w:rPr>
+              <w:t xml:space="preserve">12,309</w:t>
+            </w:r>
+          </w:p>
+        </w:tc>
+        <w:tc>
+          <w:tcPr>
+            <w:tcW w:type="dxa" w:w="1700"/>
+            <w:tcBorders>
+              <w:top w:val="single" w:color="000000" w:sz="1"/>
+              <w:left w:val="single" w:color="000000" w:sz="1"/>
+              <w:bottom w:val="single" w:color="000000" w:sz="1"/>
+              <w:right w:val="single" w:color="000000" w:sz="1"/>
+            </w:tcBorders>
+            <w:tcMar>
+              <w:top w:type="dxa" w:w="40"/>
+              <w:left w:type="dxa" w:w="80"/>
+              <w:bottom w:type="dxa" w:w="40"/>
+              <w:right w:type="dxa" w:w="80"/>
+            </w:tcMar>
+          </w:tcPr>
+          <w:p>
+            <w:pPr>
+              <w:spacing w:line="276"/>
+              <w:jc w:val="center"/>
+            </w:pPr>
+            <w:r>
+              <w:rPr>
+                <w:rFonts w:ascii="Calibri" w:cs="Calibri" w:eastAsia="Calibri" w:hAnsi="Calibri"/>
+                <w:sz w:val="20"/>
+                <w:szCs w:val="20"/>
+              </w:rPr>
+              <w:t xml:space="preserve">4,219 (34.3%)</w:t>
+            </w:r>
+          </w:p>
+        </w:tc>
+        <w:tc>
+          <w:tcPr>
+            <w:tcW w:type="dxa" w:w="1400"/>
+            <w:tcBorders>
+              <w:top w:val="single" w:color="000000" w:sz="1"/>
+              <w:left w:val="single" w:color="000000" w:sz="1"/>
+              <w:bottom w:val="single" w:color="000000" w:sz="1"/>
+              <w:right w:val="single" w:color="000000" w:sz="1"/>
+            </w:tcBorders>
+            <w:tcMar>
+              <w:top w:type="dxa" w:w="40"/>
+              <w:left w:type="dxa" w:w="80"/>
+              <w:bottom w:type="dxa" w:w="40"/>
+              <w:right w:type="dxa" w:w="80"/>
+            </w:tcMar>
+          </w:tcPr>
+          <w:p>
+            <w:pPr>
+              <w:spacing w:line="276"/>
+              <w:jc w:val="center"/>
+            </w:pPr>
+            <w:r>
+              <w:rPr>
+                <w:rFonts w:ascii="Calibri" w:cs="Calibri" w:eastAsia="Calibri" w:hAnsi="Calibri"/>
+                <w:sz w:val="20"/>
+                <w:szCs w:val="20"/>
+              </w:rPr>
+              <w:t xml:space="preserve">0.480</w:t>
+            </w:r>
+          </w:p>
+        </w:tc>
+        <w:tc>
+          <w:tcPr>
+            <w:tcW w:type="dxa" w:w="1700"/>
+            <w:tcBorders>
+              <w:top w:val="single" w:color="000000" w:sz="1"/>
+              <w:left w:val="single" w:color="000000" w:sz="1"/>
+              <w:bottom w:val="single" w:color="000000" w:sz="1"/>
+              <w:right w:val="single" w:color="000000" w:sz="1"/>
+            </w:tcBorders>
+            <w:tcMar>
+              <w:top w:type="dxa" w:w="40"/>
+              <w:left w:type="dxa" w:w="80"/>
+              <w:bottom w:type="dxa" w:w="40"/>
+              <w:right w:type="dxa" w:w="80"/>
+            </w:tcMar>
+          </w:tcPr>
+          <w:p>
+            <w:pPr>
+              <w:spacing w:line="276"/>
+              <w:jc w:val="center"/>
+            </w:pPr>
+            <w:r>
+              <w:rPr>
+                <w:rFonts w:ascii="Calibri" w:cs="Calibri" w:eastAsia="Calibri" w:hAnsi="Calibri"/>
+                <w:b/>
+                <w:bCs/>
+                <w:sz w:val="20"/>
+                <w:szCs w:val="20"/>
+              </w:rPr>
+              <w:t xml:space="preserve">0.731</w:t>
+            </w:r>
+          </w:p>
+        </w:tc>
+        <w:tc>
+          <w:tcPr>
+            <w:tcW w:type="dxa" w:w="1300"/>
+            <w:tcBorders>
+              <w:top w:val="single" w:color="000000" w:sz="1"/>
+              <w:left w:val="single" w:color="000000" w:sz="1"/>
+              <w:bottom w:val="single" w:color="000000" w:sz="1"/>
+              <w:right w:val="single" w:color="000000" w:sz="1"/>
+            </w:tcBorders>
+            <w:tcMar>
+              <w:top w:type="dxa" w:w="40"/>
+              <w:left w:type="dxa" w:w="80"/>
+              <w:bottom w:type="dxa" w:w="40"/>
+              <w:right w:type="dxa" w:w="80"/>
+            </w:tcMar>
+          </w:tcPr>
+          <w:p>
+            <w:pPr>
+              <w:spacing w:line="276"/>
+              <w:jc w:val="center"/>
+            </w:pPr>
+            <w:r>
+              <w:rPr>
+                <w:rFonts w:ascii="Calibri" w:cs="Calibri" w:eastAsia="Calibri" w:hAnsi="Calibri"/>
+                <w:sz w:val="20"/>
+                <w:szCs w:val="20"/>
+              </w:rPr>
+              <w:t xml:space="preserve">+25.0 pp</w:t>
+            </w:r>
+          </w:p>
+        </w:tc>
+      </w:tr>
+    </w:tbl>
+    <w:p>
+      <w:pPr>
+        <w:spacing w:after="120" w:line="276"/>
+        <w:jc w:val="both"/>
+      </w:pPr>
+      <w:r>
+        <w:rPr>
+          <w:rFonts w:ascii="Calibri" w:cs="Calibri" w:eastAsia="Calibri" w:hAnsi="Calibri"/>
+          <w:sz w:val="20"/>
+          <w:szCs w:val="20"/>
+        </w:rPr>
+        <w:t xml:space="preserve">The floor effect is larger for Level 1 because the reference answer makes the grader more discriminative — it assigns score 0.0 more frequently to incorrect answers, which paradoxically increases the proportion of untestable pairs. After correcting for this artefact, the LLM’s sensitivity detection is substantially stronger than headline figures suggest: Level 1 detects meaning-altering perturbations in 73.1% of testable cases, compared to the uncorrected 48.0%. The analysis script is included in the repository (scripts/analyze_floor_effect.py) for full reproducibility.</w:t>
+      </w:r>
+    </w:p>
+    <w:p>
+      <w:pPr>
+        <w:spacing w:after="120" w:before="240" w:line="276"/>
       </w:pPr>
       <w:r>
         <w:rPr>
@@ -2773,7 +3525,7 @@
     </w:p>
     <w:p>
       <w:pPr>
-        <w:spacing w:after="100" w:before="200"/>
+        <w:spacing w:after="100" w:before="200" w:line="276"/>
       </w:pPr>
       <w:r>
         <w:rPr>
@@ -2816,7 +3568,7 @@
     </w:p>
     <w:p>
       <w:pPr>
-        <w:spacing w:after="100" w:before="200"/>
+        <w:spacing w:after="100" w:before="200" w:line="276"/>
       </w:pPr>
       <w:r>
         <w:rPr>
@@ -2845,7 +3597,35 @@
     </w:p>
     <w:p>
       <w:pPr>
-        <w:spacing w:after="100" w:before="200"/>
+        <w:spacing w:after="120" w:line="276"/>
+        <w:jc w:val="both"/>
+      </w:pPr>
+      <w:r>
+        <w:rPr>
+          <w:rFonts w:ascii="Calibri" w:cs="Calibri" w:eastAsia="Calibri" w:hAnsi="Calibri"/>
+          <w:sz w:val="20"/>
+          <w:szCs w:val="20"/>
+        </w:rPr>
+        <w:t xml:space="preserve">This is also why the LLM is dramatically better at detecting meaning-altering changes. A negation, a concept deletion, or an antonym substitution changes meaning while leaving most surface features intact. A feature-based scorer that has learned “answers containing these keywords are correct” will continue to score the perturbed answer as correct. A semantic processor recognises that the meaning has shifted.</w:t>
+      </w:r>
+    </w:p>
+    <w:p>
+      <w:pPr>
+        <w:spacing w:after="120" w:line="276"/>
+        <w:jc w:val="both"/>
+      </w:pPr>
+      <w:r>
+        <w:rPr>
+          <w:rFonts w:ascii="Calibri" w:cs="Calibri" w:eastAsia="Calibri" w:hAnsi="Calibri"/>
+          <w:sz w:val="20"/>
+          <w:szCs w:val="20"/>
+        </w:rPr>
+        <w:t xml:space="preserve">However, even the LLM is not immune. A concrete example illustrates the residual weakness. For the question “What does a voltage reading of 0 tell you about the connection between a bulb terminal and the battery?”, the student answer “the two terminals are connected” receives score 1.0 (correct). The negation perturbation produces “the two terminals are not connected” — a statement with the opposite meaning. Yet GPT-5.4 mini at Level 0 still assigns 1.0. The model appears to weigh the presence of domain-relevant terms (“terminals”, “connected”) more heavily than the negation particle that inverts their relationship. This pattern recurs across multiple negation insertions in the dataset, suggesting that even large language models can exhibit a form of keyword anchoring when the negated sentence retains high lexical overlap with a plausible correct answer.</w:t>
+      </w:r>
+    </w:p>
+    <w:p>
+      <w:pPr>
+        <w:spacing w:after="100" w:before="200" w:line="276"/>
       </w:pPr>
       <w:r>
         <w:rPr>
@@ -2897,12 +3677,12 @@
           <w:sz w:val="20"/>
           <w:szCs w:val="20"/>
         </w:rPr>
-        <w:t xml:space="preserve">We do not claim that this trade-off is unfixable. Prompt engineering, chain-of-thought instructions that require the model to assess internal coherence before keyword overlap, or few-shot examples demonstrating gaming attempts could plausibly mitigate it. The point is rather that the trade-off exists at all, that it is invisible if one measures only invariance or only accuracy, and that perturbation-first multi-dimensional evaluation is what surfaces it.</w:t>
-      </w:r>
-    </w:p>
-    <w:p>
-      <w:pPr>
-        <w:spacing w:after="100" w:before="200"/>
+        <w:t xml:space="preserve">We do not claim that this trade-off is unfixable. Prompt engineering, chain-of-thought instructions that require the model to assess internal coherence before keyword overlap, or few-shot examples demonstrating gaming attempts could plausibly mitigate it. The point is rather that the trade-off exists at all, that it is invisible if one measures only invariance or only accuracy, and that perturbation-first multi-dimensional evaluation is what surfaces it. The framework’s contribution is detecting such trade-offs before deployment, regardless of which prompting strategy is ultimately chosen.</w:t>
+      </w:r>
+    </w:p>
+    <w:p>
+      <w:pPr>
+        <w:spacing w:after="100" w:before="200" w:line="276"/>
       </w:pPr>
       <w:r>
         <w:rPr>
@@ -2968,12 +3748,12 @@
           <w:sz w:val="20"/>
           <w:szCs w:val="20"/>
         </w:rPr>
-        <w:t xml:space="preserve">Third, treat cross-question evaluation as the realistic deployment scenario for trained graders. Within-question performance describes the best case; cross-question performance describes what students will actually experience.</w:t>
-      </w:r>
-    </w:p>
-    <w:p>
-      <w:pPr>
-        <w:spacing w:after="100" w:before="200"/>
+        <w:t xml:space="preserve">Third, treat cross-question evaluation as the realistic deployment scenario for trained graders. Within-question performance describes the best case; cross-question performance describes what students will actually experience. More broadly, robustness sits alongside fairness as a precondition for the responsible deployment of automated scoring in education (Loukina et al., 2019): a grader that is unstable under meaning-preserving variation is also, by construction, a grader whose scores are unevenly distributed across superficially different but substantively equivalent answers.</w:t>
+      </w:r>
+    </w:p>
+    <w:p>
+      <w:pPr>
+        <w:spacing w:after="100" w:before="200" w:line="276"/>
       </w:pPr>
       <w:r>
         <w:rPr>
@@ -3002,7 +3782,7 @@
     </w:p>
     <w:p>
       <w:pPr>
-        <w:spacing w:after="120" w:before="240"/>
+        <w:spacing w:after="120" w:before="240" w:line="276"/>
       </w:pPr>
       <w:r>
         <w:rPr>
@@ -3059,7 +3839,7 @@
     </w:p>
     <w:p>
       <w:pPr>
-        <w:spacing w:after="120" w:before="240"/>
+        <w:spacing w:after="120" w:before="240" w:line="276"/>
       </w:pPr>
       <w:r>
         <w:rPr>
@@ -3074,7 +3854,7 @@
     </w:p>
     <w:p>
       <w:pPr>
-        <w:spacing w:after="80"/>
+        <w:spacing w:after="80" w:line="276"/>
         <w:ind w:left="360" w:hanging="360"/>
         <w:jc w:val="both"/>
       </w:pPr>
@@ -3094,7 +3874,7 @@
           <w:sz w:val="20"/>
           <w:szCs w:val="20"/>
         </w:rPr>
-        <w:t xml:space="preserve">Proceedings of EMNLP 2018</w:t>
+        <w:t xml:space="preserve">Proceedings of the 2018 Conference on Empirical Methods in Natural Language Processing (EMNLP 2018)</w:t>
       </w:r>
       <w:r>
         <w:rPr>
@@ -3107,7 +3887,7 @@
     </w:p>
     <w:p>
       <w:pPr>
-        <w:spacing w:after="80"/>
+        <w:spacing w:after="80" w:line="276"/>
         <w:ind w:left="360" w:hanging="360"/>
         <w:jc w:val="both"/>
       </w:pPr>
@@ -3127,7 +3907,7 @@
           <w:sz w:val="20"/>
           <w:szCs w:val="20"/>
         </w:rPr>
-        <w:t xml:space="preserve">Proceedings of ICLR 2018</w:t>
+        <w:t xml:space="preserve">Proceedings of the 6th International Conference on Learning Representations (ICLR 2018)</w:t>
       </w:r>
       <w:r>
         <w:rPr>
@@ -3140,7 +3920,7 @@
     </w:p>
     <w:p>
       <w:pPr>
-        <w:spacing w:after="80"/>
+        <w:spacing w:after="80" w:line="276"/>
         <w:ind w:left="360" w:hanging="360"/>
         <w:jc w:val="both"/>
       </w:pPr>
@@ -3173,7 +3953,7 @@
     </w:p>
     <w:p>
       <w:pPr>
-        <w:spacing w:after="80"/>
+        <w:spacing w:after="80" w:line="276"/>
         <w:ind w:left="360" w:hanging="360"/>
         <w:jc w:val="both"/>
       </w:pPr>
@@ -3193,7 +3973,7 @@
           <w:sz w:val="20"/>
           <w:szCs w:val="20"/>
         </w:rPr>
-        <w:t xml:space="preserve">Proceedings of EDM 2021</w:t>
+        <w:t xml:space="preserve">Proceedings of the 14th International Conference on Educational Data Mining (EDM 2021)</w:t>
       </w:r>
       <w:r>
         <w:rPr>
@@ -3206,7 +3986,7 @@
     </w:p>
     <w:p>
       <w:pPr>
-        <w:spacing w:after="80"/>
+        <w:spacing w:after="80" w:line="276"/>
         <w:ind w:left="360" w:hanging="360"/>
         <w:jc w:val="both"/>
       </w:pPr>
@@ -3239,7 +4019,7 @@
     </w:p>
     <w:p>
       <w:pPr>
-        <w:spacing w:after="80"/>
+        <w:spacing w:after="80" w:line="276"/>
         <w:ind w:left="360" w:hanging="360"/>
         <w:jc w:val="both"/>
       </w:pPr>
@@ -3259,7 +4039,7 @@
           <w:sz w:val="20"/>
           <w:szCs w:val="20"/>
         </w:rPr>
-        <w:t xml:space="preserve">Proceedings of COLING 2020</w:t>
+        <w:t xml:space="preserve">Proceedings of the 28th International Conference on Computational Linguistics (COLING 2020)</w:t>
       </w:r>
       <w:r>
         <w:rPr>
@@ -3272,7 +4052,7 @@
     </w:p>
     <w:p>
       <w:pPr>
-        <w:spacing w:after="80"/>
+        <w:spacing w:after="80" w:line="276"/>
         <w:ind w:left="360" w:hanging="360"/>
         <w:jc w:val="both"/>
       </w:pPr>
@@ -3282,7 +4062,7 @@
           <w:sz w:val="20"/>
           <w:szCs w:val="20"/>
         </w:rPr>
-        <w:t xml:space="preserve">Dorsey, D. and Michaels, H. (2022) ‘Validity arguments meet artificial intelligence in innovative educational assessment’, </w:t>
+        <w:t xml:space="preserve">Dorsey, D. and Michaels, H. (2022) ‘Validity arguments meet artificial intelligence in innovative educational assessment: a discussion and look forward’, </w:t>
       </w:r>
       <w:r>
         <w:rPr>
@@ -3300,12 +4080,12 @@
           <w:sz w:val="20"/>
           <w:szCs w:val="20"/>
         </w:rPr>
-        <w:t xml:space="preserve">, 59(3), pp. 270–287.</w:t>
-      </w:r>
-    </w:p>
-    <w:p>
-      <w:pPr>
-        <w:spacing w:after="80"/>
+        <w:t xml:space="preserve">, 59(3), pp. 267–271.</w:t>
+      </w:r>
+    </w:p>
+    <w:p>
+      <w:pPr>
+        <w:spacing w:after="80" w:line="276"/>
         <w:ind w:left="360" w:hanging="360"/>
         <w:jc w:val="both"/>
       </w:pPr>
@@ -3325,7 +4105,7 @@
           <w:sz w:val="20"/>
           <w:szCs w:val="20"/>
         </w:rPr>
-        <w:t xml:space="preserve">Proceedings of SemEval 2013</w:t>
+        <w:t xml:space="preserve">Proceedings of the 7th International Workshop on Semantic Evaluation (SemEval 2013)</w:t>
       </w:r>
       <w:r>
         <w:rPr>
@@ -3338,7 +4118,7 @@
     </w:p>
     <w:p>
       <w:pPr>
-        <w:spacing w:after="80"/>
+        <w:spacing w:after="80" w:line="276"/>
         <w:ind w:left="360" w:hanging="360"/>
         <w:jc w:val="both"/>
       </w:pPr>
@@ -3358,7 +4138,7 @@
           <w:sz w:val="20"/>
           <w:szCs w:val="20"/>
         </w:rPr>
-        <w:t xml:space="preserve">Proceedings of ACL 2018</w:t>
+        <w:t xml:space="preserve">Proceedings of the 56th Annual Meeting of the Association for Computational Linguistics (ACL 2018)</w:t>
       </w:r>
       <w:r>
         <w:rPr>
@@ -3371,7 +4151,7 @@
     </w:p>
     <w:p>
       <w:pPr>
-        <w:spacing w:after="80"/>
+        <w:spacing w:after="80" w:line="276"/>
         <w:ind w:left="360" w:hanging="360"/>
         <w:jc w:val="both"/>
       </w:pPr>
@@ -3404,7 +4184,7 @@
     </w:p>
     <w:p>
       <w:pPr>
-        <w:spacing w:after="80"/>
+        <w:spacing w:after="80" w:line="276"/>
         <w:ind w:left="360" w:hanging="360"/>
         <w:jc w:val="both"/>
       </w:pPr>
@@ -3437,7 +4217,7 @@
     </w:p>
     <w:p>
       <w:pPr>
-        <w:spacing w:after="80"/>
+        <w:spacing w:after="80" w:line="276"/>
         <w:ind w:left="360" w:hanging="360"/>
         <w:jc w:val="both"/>
       </w:pPr>
@@ -3457,7 +4237,7 @@
           <w:sz w:val="20"/>
           <w:szCs w:val="20"/>
         </w:rPr>
-        <w:t xml:space="preserve">Proceedings of BEA 2015</w:t>
+        <w:t xml:space="preserve">Proceedings of the 10th Workshop on Innovative Use of NLP for Building Educational Applications (BEA 2015)</w:t>
       </w:r>
       <w:r>
         <w:rPr>
@@ -3470,7 +4250,7 @@
     </w:p>
     <w:p>
       <w:pPr>
-        <w:spacing w:after="80"/>
+        <w:spacing w:after="80" w:line="276"/>
         <w:ind w:left="360" w:hanging="360"/>
         <w:jc w:val="both"/>
       </w:pPr>
@@ -3490,7 +4270,7 @@
           <w:sz w:val="20"/>
           <w:szCs w:val="20"/>
         </w:rPr>
-        <w:t xml:space="preserve">Proceedings of EMNLP 2017</w:t>
+        <w:t xml:space="preserve">Proceedings of the 2017 Conference on Empirical Methods in Natural Language Processing (EMNLP 2017)</w:t>
       </w:r>
       <w:r>
         <w:rPr>
@@ -3503,7 +4283,7 @@
     </w:p>
     <w:p>
       <w:pPr>
-        <w:spacing w:after="80"/>
+        <w:spacing w:after="80" w:line="276"/>
         <w:ind w:left="360" w:hanging="360"/>
         <w:jc w:val="both"/>
       </w:pPr>
@@ -3523,7 +4303,7 @@
           <w:sz w:val="20"/>
           <w:szCs w:val="20"/>
         </w:rPr>
-        <w:t xml:space="preserve">Proceedings of AAAI 2020</w:t>
+        <w:t xml:space="preserve">Proceedings of the Thirty-Fourth AAAI Conference on Artificial Intelligence (AAAI 2020)</w:t>
       </w:r>
       <w:r>
         <w:rPr>
@@ -3536,7 +4316,7 @@
     </w:p>
     <w:p>
       <w:pPr>
-        <w:spacing w:after="80"/>
+        <w:spacing w:after="80" w:line="276"/>
         <w:ind w:left="360" w:hanging="360"/>
         <w:jc w:val="both"/>
       </w:pPr>
@@ -3569,7 +4349,7 @@
     </w:p>
     <w:p>
       <w:pPr>
-        <w:spacing w:after="80"/>
+        <w:spacing w:after="80" w:line="276"/>
         <w:ind w:left="360" w:hanging="360"/>
         <w:jc w:val="both"/>
       </w:pPr>
@@ -3579,7 +4359,7 @@
           <w:sz w:val="20"/>
           <w:szCs w:val="20"/>
         </w:rPr>
-        <w:t xml:space="preserve">Kumar, Y., Aggarwal, S., Mahata, D., Shah, R.R., Kumaraguru, P. and Zimmermann, R. (2020) ‘Calling out bluff: Attacking the robustness of automatic scoring systems with simple adversarial testing’, </w:t>
+        <w:t xml:space="preserve">Kumar, Y., Bhatia, M., Kabra, A., Li, J.J., Jin, D. and Shah, R.R. (2020) ‘Calling out bluff: Attacking the robustness of automatic scoring systems with simple adversarial testing’, </w:t>
       </w:r>
       <w:r>
         <w:rPr>
@@ -3602,7 +4382,7 @@
     </w:p>
     <w:p>
       <w:pPr>
-        <w:spacing w:after="80"/>
+        <w:spacing w:after="80" w:line="276"/>
         <w:ind w:left="360" w:hanging="360"/>
         <w:jc w:val="both"/>
       </w:pPr>
@@ -3635,7 +4415,7 @@
     </w:p>
     <w:p>
       <w:pPr>
-        <w:spacing w:after="80"/>
+        <w:spacing w:after="80" w:line="276"/>
         <w:ind w:left="360" w:hanging="360"/>
         <w:jc w:val="both"/>
       </w:pPr>
@@ -3655,20 +4435,20 @@
           <w:sz w:val="20"/>
           <w:szCs w:val="20"/>
         </w:rPr>
-        <w:t xml:space="preserve">Proceedings of BEA 2019</w:t>
-      </w:r>
-      <w:r>
-        <w:rPr>
-          <w:rFonts w:ascii="Calibri" w:cs="Calibri" w:eastAsia="Calibri" w:hAnsi="Calibri"/>
-          <w:sz w:val="20"/>
-          <w:szCs w:val="20"/>
-        </w:rPr>
-        <w:t xml:space="preserve">. Florence: Association for Computational Linguistics, pp. 1–11.</w:t>
-      </w:r>
-    </w:p>
-    <w:p>
-      <w:pPr>
-        <w:spacing w:after="80"/>
+        <w:t xml:space="preserve">Proceedings of the 14th Workshop on Innovative Use of NLP for Building Educational Applications (BEA 2019)</w:t>
+      </w:r>
+      <w:r>
+        <w:rPr>
+          <w:rFonts w:ascii="Calibri" w:cs="Calibri" w:eastAsia="Calibri" w:hAnsi="Calibri"/>
+          <w:sz w:val="20"/>
+          <w:szCs w:val="20"/>
+        </w:rPr>
+        <w:t xml:space="preserve">. Florence: Association for Computational Linguistics, pp. 1–10.</w:t>
+      </w:r>
+    </w:p>
+    <w:p>
+      <w:pPr>
+        <w:spacing w:after="80" w:line="276"/>
         <w:ind w:left="360" w:hanging="360"/>
         <w:jc w:val="both"/>
       </w:pPr>
@@ -3701,7 +4481,7 @@
     </w:p>
     <w:p>
       <w:pPr>
-        <w:spacing w:after="80"/>
+        <w:spacing w:after="80" w:line="276"/>
         <w:ind w:left="360" w:hanging="360"/>
         <w:jc w:val="both"/>
       </w:pPr>
@@ -3734,7 +4514,7 @@
     </w:p>
     <w:p>
       <w:pPr>
-        <w:spacing w:after="80"/>
+        <w:spacing w:after="80" w:line="276"/>
         <w:ind w:left="360" w:hanging="360"/>
         <w:jc w:val="both"/>
       </w:pPr>
@@ -3754,7 +4534,7 @@
           <w:sz w:val="20"/>
           <w:szCs w:val="20"/>
         </w:rPr>
-        <w:t xml:space="preserve">Proceedings of ACL 2011</w:t>
+        <w:t xml:space="preserve">Proceedings of the 49th Annual Meeting of the Association for Computational Linguistics (ACL 2011)</w:t>
       </w:r>
       <w:r>
         <w:rPr>
@@ -3767,7 +4547,7 @@
     </w:p>
     <w:p>
       <w:pPr>
-        <w:spacing w:after="80"/>
+        <w:spacing w:after="80" w:line="276"/>
         <w:ind w:left="360" w:hanging="360"/>
         <w:jc w:val="both"/>
       </w:pPr>
@@ -3787,7 +4567,7 @@
           <w:sz w:val="20"/>
           <w:szCs w:val="20"/>
         </w:rPr>
-        <w:t xml:space="preserve">Proceedings of EMNLP 2020: System Demonstrations</w:t>
+        <w:t xml:space="preserve">Proceedings of the 2020 Conference on Empirical Methods in Natural Language Processing: System Demonstrations (EMNLP 2020)</w:t>
       </w:r>
       <w:r>
         <w:rPr>
@@ -3800,7 +4580,7 @@
     </w:p>
     <w:p>
       <w:pPr>
-        <w:spacing w:after="80"/>
+        <w:spacing w:after="80" w:line="276"/>
         <w:ind w:left="360" w:hanging="360"/>
         <w:jc w:val="both"/>
       </w:pPr>
@@ -3820,7 +4600,7 @@
           <w:sz w:val="20"/>
           <w:szCs w:val="20"/>
         </w:rPr>
-        <w:t xml:space="preserve">Proceedings of BEA 2023</w:t>
+        <w:t xml:space="preserve">Proceedings of the 18th Workshop on Innovative Use of NLP for Building Educational Applications (BEA 2023)</w:t>
       </w:r>
       <w:r>
         <w:rPr>
@@ -3833,7 +4613,7 @@
     </w:p>
     <w:p>
       <w:pPr>
-        <w:spacing w:after="80"/>
+        <w:spacing w:after="80" w:line="276"/>
         <w:ind w:left="360" w:hanging="360"/>
         <w:jc w:val="both"/>
       </w:pPr>
@@ -3866,7 +4646,7 @@
     </w:p>
     <w:p>
       <w:pPr>
-        <w:spacing w:after="80"/>
+        <w:spacing w:after="80" w:line="276"/>
         <w:ind w:left="360" w:hanging="360"/>
         <w:jc w:val="both"/>
       </w:pPr>
@@ -3886,7 +4666,7 @@
           <w:sz w:val="20"/>
           <w:szCs w:val="20"/>
         </w:rPr>
-        <w:t xml:space="preserve">Proceedings of ACL 2020</w:t>
+        <w:t xml:space="preserve">Proceedings of the 58th Annual Meeting of the Association for Computational Linguistics (ACL 2020)</w:t>
       </w:r>
       <w:r>
         <w:rPr>
@@ -3899,7 +4679,7 @@
     </w:p>
     <w:p>
       <w:pPr>
-        <w:spacing w:after="80"/>
+        <w:spacing w:after="80" w:line="276"/>
         <w:ind w:left="360" w:hanging="360"/>
         <w:jc w:val="both"/>
       </w:pPr>
@@ -3919,20 +4699,20 @@
           <w:sz w:val="20"/>
           <w:szCs w:val="20"/>
         </w:rPr>
-        <w:t xml:space="preserve">Proceedings of BEA 2017</w:t>
-      </w:r>
-      <w:r>
-        <w:rPr>
-          <w:rFonts w:ascii="Calibri" w:cs="Calibri" w:eastAsia="Calibri" w:hAnsi="Calibri"/>
-          <w:sz w:val="20"/>
-          <w:szCs w:val="20"/>
-        </w:rPr>
-        <w:t xml:space="preserve">. Copenhagen: Association for Computational Linguistics, pp. 217–227.</w:t>
-      </w:r>
-    </w:p>
-    <w:p>
-      <w:pPr>
-        <w:spacing w:after="80"/>
+        <w:t xml:space="preserve">Proceedings of the 12th Workshop on Innovative Use of NLP for Building Educational Applications (BEA 2017)</w:t>
+      </w:r>
+      <w:r>
+        <w:rPr>
+          <w:rFonts w:ascii="Calibri" w:cs="Calibri" w:eastAsia="Calibri" w:hAnsi="Calibri"/>
+          <w:sz w:val="20"/>
+          <w:szCs w:val="20"/>
+        </w:rPr>
+        <w:t xml:space="preserve">. Copenhagen: Association for Computational Linguistics, pp. 159–168.</w:t>
+      </w:r>
+    </w:p>
+    <w:p>
+      <w:pPr>
+        <w:spacing w:after="80" w:line="276"/>
         <w:ind w:left="360" w:hanging="360"/>
         <w:jc w:val="both"/>
       </w:pPr>
@@ -3960,12 +4740,12 @@
           <w:sz w:val="20"/>
           <w:szCs w:val="20"/>
         </w:rPr>
-        <w:t xml:space="preserve">, 59(3), pp. 314–334.</w:t>
-      </w:r>
-    </w:p>
-    <w:p>
-      <w:pPr>
-        <w:spacing w:after="80"/>
+        <w:t xml:space="preserve">, 59(3), pp. 314–337.</w:t>
+      </w:r>
+    </w:p>
+    <w:p>
+      <w:pPr>
+        <w:spacing w:after="80" w:line="276"/>
         <w:ind w:left="360" w:hanging="360"/>
         <w:jc w:val="both"/>
       </w:pPr>
@@ -3975,7 +4755,7 @@
           <w:sz w:val="20"/>
           <w:szCs w:val="20"/>
         </w:rPr>
-        <w:t xml:space="preserve">Sung, C., Dhamecha, T.I., Saha, S., Ma, T., Reddy, V. and Arora, R. (2019) ‘Improving short answer grading using transformer-based pre-training’, in </w:t>
+        <w:t xml:space="preserve">Sung, C., Dhamecha, T.I. and Mukhi, N. (2019) ‘Pre-training BERT on domain resources for short answer grading’, in </w:t>
       </w:r>
       <w:r>
         <w:rPr>
@@ -3985,20 +4765,20 @@
           <w:sz w:val="20"/>
           <w:szCs w:val="20"/>
         </w:rPr>
-        <w:t xml:space="preserve">Proceedings of AIED 2019</w:t>
-      </w:r>
-      <w:r>
-        <w:rPr>
-          <w:rFonts w:ascii="Calibri" w:cs="Calibri" w:eastAsia="Calibri" w:hAnsi="Calibri"/>
-          <w:sz w:val="20"/>
-          <w:szCs w:val="20"/>
-        </w:rPr>
-        <w:t xml:space="preserve">. Lecture Notes in Computer Science, vol. 11625. Cham: Springer, pp. 491–502.</w:t>
-      </w:r>
-    </w:p>
-    <w:p>
-      <w:pPr>
-        <w:spacing w:after="80"/>
+        <w:t xml:space="preserve">Proceedings of the 20th International Conference on Artificial Intelligence in Education (AIED 2019)</w:t>
+      </w:r>
+      <w:r>
+        <w:rPr>
+          <w:rFonts w:ascii="Calibri" w:cs="Calibri" w:eastAsia="Calibri" w:hAnsi="Calibri"/>
+          <w:sz w:val="20"/>
+          <w:szCs w:val="20"/>
+        </w:rPr>
+        <w:t xml:space="preserve">. Lecture Notes in Computer Science, vol. 11625. Cham: Springer, pp. 469–481.</w:t>
+      </w:r>
+    </w:p>
+    <w:p>
+      <w:pPr>
+        <w:spacing w:after="80" w:line="276"/>
         <w:ind w:left="360" w:hanging="360"/>
         <w:jc w:val="both"/>
       </w:pPr>
@@ -4008,7 +4788,7 @@
           <w:sz w:val="20"/>
           <w:szCs w:val="20"/>
         </w:rPr>
-        <w:t xml:space="preserve">Wang, S., Liu, W., Zhang, Y., Zheng, X. and Gao, S. (2022) ‘Measure and improve robustness in NLP models: A survey’, in </w:t>
+        <w:t xml:space="preserve">Wang, X., Wang, H. and Yang, D. (2022) ‘Measure and improve robustness in NLP models: A survey’, in </w:t>
       </w:r>
       <w:r>
         <w:rPr>
@@ -4026,12 +4806,12 @@
           <w:sz w:val="20"/>
           <w:szCs w:val="20"/>
         </w:rPr>
-        <w:t xml:space="preserve">. Seattle: Association for Computational Linguistics, pp. 4569–4588.</w:t>
-      </w:r>
-    </w:p>
-    <w:p>
-      <w:pPr>
-        <w:spacing w:after="80"/>
+        <w:t xml:space="preserve">. Seattle: Association for Computational Linguistics, pp. 4569–4586.</w:t>
+      </w:r>
+    </w:p>
+    <w:p>
+      <w:pPr>
+        <w:spacing w:after="80" w:line="276"/>
         <w:ind w:left="360" w:hanging="360"/>
         <w:jc w:val="both"/>
       </w:pPr>
@@ -4291,13 +5071,7 @@
 <file path=word/styles.xml><?xml version="1.0" encoding="utf-8"?>
 <w:styles xmlns:mc="http://schemas.openxmlformats.org/markup-compatibility/2006" xmlns:r="http://schemas.openxmlformats.org/officeDocument/2006/relationships" xmlns:w="http://schemas.openxmlformats.org/wordprocessingml/2006/main" xmlns:w14="http://schemas.microsoft.com/office/word/2010/wordml" xmlns:w15="http://schemas.microsoft.com/office/word/2012/wordml" mc:Ignorable="w14 w15">
   <w:docDefaults>
-    <w:rPrDefault>
-      <w:rPr>
-        <w:rFonts w:ascii="Calibri" w:cs="Calibri" w:eastAsia="Calibri" w:hAnsi="Calibri"/>
-        <w:sz w:val="20"/>
-        <w:szCs w:val="20"/>
-      </w:rPr>
-    </w:rPrDefault>
+    <w:rPrDefault/>
     <w:pPrDefault/>
   </w:docDefaults>
   <w:style w:type="paragraph" w:styleId="Title">

</xml_diff>